<commit_message>
Fix table property order (schema-valid docx for strict parsers); settings zoom fix in letters
Co-Authored-By: Claude Opus 5.5 <noreply@anthropic.com>
</commit_message>
<xml_diff>
--- a/manuscript/FMI_Hybrid_Liquid_Loading_Estimation_v6.docx
+++ b/manuscript/FMI_Hybrid_Liquid_Loading_Estimation_v6.docx
@@ -698,8 +698,8 @@
       <w:tblPr>
         <w:tblStyle w:val="LightGridAccent1"/>
         <w:tblW w:type="dxa" w:w="9792"/>
+        <w:tblLayout w:type="fixed"/>
         <w:tblLook w:firstColumn="1" w:firstRow="1" w:lastColumn="0" w:lastRow="0" w:noHBand="0" w:noVBand="1" w:val="04a0"/>
-        <w:tblLayout w:type="fixed"/>
       </w:tblPr>
       <w:tblGrid>
         <w:gridCol w:w="1653"/>
@@ -6871,8 +6871,8 @@
       <w:tblPr>
         <w:tblStyle w:val="LightGridAccent1"/>
         <w:tblW w:type="dxa" w:w="9792"/>
+        <w:tblLayout w:type="fixed"/>
         <w:tblLook w:firstColumn="1" w:firstRow="1" w:lastColumn="0" w:lastRow="0" w:noHBand="0" w:noVBand="1" w:val="04a0"/>
-        <w:tblLayout w:type="fixed"/>
       </w:tblPr>
       <w:tblGrid>
         <w:gridCol w:w="2504"/>
@@ -8720,8 +8720,8 @@
       <w:tblPr>
         <w:tblStyle w:val="LightGridAccent1"/>
         <w:tblW w:type="dxa" w:w="9792"/>
+        <w:tblLayout w:type="fixed"/>
         <w:tblLook w:firstColumn="1" w:firstRow="1" w:lastColumn="0" w:lastRow="0" w:noHBand="0" w:noVBand="1" w:val="04a0"/>
-        <w:tblLayout w:type="fixed"/>
       </w:tblPr>
       <w:tblGrid>
         <w:gridCol w:w="3757"/>
@@ -10200,8 +10200,8 @@
       <w:tblPr>
         <w:tblStyle w:val="LightGridAccent1"/>
         <w:tblW w:type="dxa" w:w="9792"/>
+        <w:tblLayout w:type="fixed"/>
         <w:tblLook w:firstColumn="1" w:firstRow="1" w:lastColumn="0" w:lastRow="0" w:noHBand="0" w:noVBand="1" w:val="04a0"/>
-        <w:tblLayout w:type="fixed"/>
       </w:tblPr>
       <w:tblGrid>
         <w:gridCol w:w="1017"/>
@@ -11414,8 +11414,8 @@
       <w:tblPr>
         <w:tblStyle w:val="LightGridAccent1"/>
         <w:tblW w:type="dxa" w:w="9792"/>
+        <w:tblLayout w:type="fixed"/>
         <w:tblLook w:firstColumn="1" w:firstRow="1" w:lastColumn="0" w:lastRow="0" w:noHBand="0" w:noVBand="1" w:val="04a0"/>
-        <w:tblLayout w:type="fixed"/>
       </w:tblPr>
       <w:tblGrid>
         <w:gridCol w:w="1119"/>
@@ -12444,8 +12444,8 @@
       <w:tblPr>
         <w:tblStyle w:val="LightGridAccent1"/>
         <w:tblW w:type="dxa" w:w="9792"/>
+        <w:tblLayout w:type="fixed"/>
         <w:tblLook w:firstColumn="1" w:firstRow="1" w:lastColumn="0" w:lastRow="0" w:noHBand="0" w:noVBand="1" w:val="04a0"/>
-        <w:tblLayout w:type="fixed"/>
       </w:tblPr>
       <w:tblGrid>
         <w:gridCol w:w="3340"/>
@@ -14151,8 +14151,8 @@
       <w:tblPr>
         <w:tblStyle w:val="LightGridAccent1"/>
         <w:tblW w:type="dxa" w:w="9792"/>
+        <w:tblLayout w:type="fixed"/>
         <w:tblLook w:firstColumn="1" w:firstRow="1" w:lastColumn="0" w:lastRow="0" w:noHBand="0" w:noVBand="1" w:val="04a0"/>
-        <w:tblLayout w:type="fixed"/>
       </w:tblPr>
       <w:tblGrid>
         <w:gridCol w:w="4380"/>
@@ -16009,8 +16009,8 @@
       <w:tblPr>
         <w:tblStyle w:val="LightGridAccent1"/>
         <w:tblW w:type="dxa" w:w="9792"/>
+        <w:tblLayout w:type="fixed"/>
         <w:tblLook w:firstColumn="1" w:firstRow="1" w:lastColumn="0" w:lastRow="0" w:noHBand="0" w:noVBand="1" w:val="04a0"/>
-        <w:tblLayout w:type="fixed"/>
       </w:tblPr>
       <w:tblGrid>
         <w:gridCol w:w="2277"/>
@@ -17407,8 +17407,8 @@
       <w:tblPr>
         <w:tblStyle w:val="LightGridAccent1"/>
         <w:tblW w:type="dxa" w:w="9792"/>
+        <w:tblLayout w:type="fixed"/>
         <w:tblLook w:firstColumn="1" w:firstRow="1" w:lastColumn="0" w:lastRow="0" w:noHBand="0" w:noVBand="1" w:val="04a0"/>
-        <w:tblLayout w:type="fixed"/>
       </w:tblPr>
       <w:tblGrid>
         <w:gridCol w:w="2251"/>
@@ -18277,8 +18277,8 @@
       <w:tblPr>
         <w:tblStyle w:val="LightGridAccent1"/>
         <w:tblW w:type="dxa" w:w="9792"/>
+        <w:tblLayout w:type="fixed"/>
         <w:tblLook w:firstColumn="1" w:firstRow="1" w:lastColumn="0" w:lastRow="0" w:noHBand="0" w:noVBand="1" w:val="04a0"/>
-        <w:tblLayout w:type="fixed"/>
       </w:tblPr>
       <w:tblGrid>
         <w:gridCol w:w="1859"/>
@@ -19414,8 +19414,8 @@
       <w:tblPr>
         <w:tblStyle w:val="LightGridAccent1"/>
         <w:tblW w:type="dxa" w:w="9792"/>
+        <w:tblLayout w:type="fixed"/>
         <w:tblLook w:firstColumn="1" w:firstRow="1" w:lastColumn="0" w:lastRow="0" w:noHBand="0" w:noVBand="1" w:val="04a0"/>
-        <w:tblLayout w:type="fixed"/>
       </w:tblPr>
       <w:tblGrid>
         <w:gridCol w:w="2448"/>
@@ -21741,8 +21741,8 @@
       <w:tblPr>
         <w:tblStyle w:val="LightGridAccent1"/>
         <w:tblW w:type="dxa" w:w="9792"/>
+        <w:tblLayout w:type="fixed"/>
         <w:tblLook w:firstColumn="1" w:firstRow="1" w:lastColumn="0" w:lastRow="0" w:noHBand="0" w:noVBand="1" w:val="04a0"/>
-        <w:tblLayout w:type="fixed"/>
       </w:tblPr>
       <w:tblGrid>
         <w:gridCol w:w="932"/>
@@ -22855,8 +22855,8 @@
       <w:tblPr>
         <w:tblStyle w:val="LightGridAccent1"/>
         <w:tblW w:type="dxa" w:w="9792"/>
+        <w:tblLayout w:type="fixed"/>
         <w:tblLook w:firstColumn="1" w:firstRow="1" w:lastColumn="0" w:lastRow="0" w:noHBand="0" w:noVBand="1" w:val="04a0"/>
-        <w:tblLayout w:type="fixed"/>
       </w:tblPr>
       <w:tblGrid>
         <w:gridCol w:w="1958"/>

</xml_diff>

<commit_message>
Revision 2: merge Rubriq language edits (selectively); letters; v1.2.0
170 grammar-only edits accepted from the Rubriq-edited copy; edits that changed
meaning, terminology (over-reading, carryover), reference titles or symbols were
rejected. Every number in the manuscript is unchanged (audited).

Co-Authored-By: Claude Opus 5.5 <noreply@anthropic.com>
</commit_message>
<xml_diff>
--- a/manuscript/FMI_Hybrid_Liquid_Loading_Estimation_v6.docx
+++ b/manuscript/FMI_Hybrid_Liquid_Loading_Estimation_v6.docx
@@ -91,7 +91,7 @@
           <w:i w:val="0"/>
           <w:sz w:val="21"/>
         </w:rPr>
-        <w:t>Wet-gas corrections for differential-pressure flowmeters express the indicated gas rate as the true rate multiplied by an over-reading factor that depends on the Lockhart–Martinelli parameter, which most metering stations do not measure. Here the liquid loading is treated as a latent variable and estimated from two structurally distinct sources already at the station: a thermodynamic flash prediction from composition, pressure and temperature, and a regression on the meter's own diagnostic signals. The two estimates are fused under an uncertainty budget that includes upstream liquid carryover, which the flash cannot see, and their disagreement, a consistency index, decides whether the correlation is applied. The study is computational: no loop data were used and the diagnostic estimator is specified but not fitted, so every result is a modeled uncertainty. Over 300,000 Monte Carlo realizations of an orifice meter in a rich-gas envelope (60–85 kgf/cm², 30–60 °C), correction narrows the 95% error band from ±14.94% to ±4.26% (±4.28% before the acceptance test), against ±1.82% with the true liquid loading and ±3.99% for the diagnostic estimator alone. Fusion therefore improves on the diagnostic estimator only when carryover occupies less than about 16% of operating time, when the diagnostic estimator is poorer than assumed, or when it carries a persistent positive bias. At the adopted threshold the consistency index has 94% precision but 3% sensitivity for carryover: it flags gross disagreement rather than detecting carryover. An independent orifice correlation in the forward model widens the band to ±5.26%. A falsifiable loop experiment is specified.</w:t>
+        <w:t>Wet-gas corrections for differential-pressure flowmeters express the indicated gas rate as the true rate multiplied by an over-reading factor that depends on the Lockhart–Martinelli parameter, which most metering stations do not measure. Here, the liquid loading is treated as a latent variable and estimated from two structurally distinct sources already at the station: a thermodynamic flash prediction from composition, pressure and temperature and a regression on the meter's own diagnostic signals. The two estimates are fused under an uncertainty budget that includes upstream liquid carryover, which the flash cannot see, and their disagreement, a consistency index, determines whether the correlation is applied. The study is computational: no loop data were used, and the diagnostic estimator is specified but not fitted, so every result is a modeled uncertainty. Over 300,000 Monte Carlo realizations of an orifice meter in a rich-gas envelope (60–85 kgf/cm², 30–60 °C), correction narrows the 95% error band from ±14.94% to ±4.26% (±4.28% before the acceptance test), against ±1.82% with the true liquid loading and ±3.99% for the diagnostic estimator alone. Fusion therefore improves on the diagnostic estimator only when carryover occupies less than approximately 16% of the operating time, when the diagnostic estimator is poorer than assumed, or when it has a persistent positive bias. At the adopted threshold, the consistency index has 94% precision but 3% sensitivity for carryover: it flags gross disagreement rather than detecting carryover. An independent orifice correlation in the forward model widens the band to ±5.26%. A falsifiable loop experiment is specified.</w:t>
       </w:r>
     </w:p>
     <w:p>
@@ -144,7 +144,7 @@
           <w:i w:val="0"/>
           <w:sz w:val="21"/>
         </w:rPr>
-        <w:t>Single-phase gas flowmeters are widely installed on streams that carry entrained liquid. In a differential-pressure meter the liquid raises the measured differential pressure above its dry-gas value, so a flow computer that correctly applies ISO 5167 [1] or AGA Report No. 3 [2] reports a gas rate that is too high. The error is not marginal: for a rich gas at typical production pressures, condensate–gas ratios of 50 and 100 bbl/MMscf give over-readings of approximately 8% and 16% on the Chisholm multiplier. For a fiscal or allocation measurement, an error of this size is not a refinement of the uncertainty budget but its dominant term.</w:t>
+        <w:t>Single-phase gas flowmeters are widely installed on streams that carry entrained liquid. In a differential-pressure meter, the liquid raises the measured differential pressure above its dry-gas value, so a flow computer that correctly applies ISO 5167 [1] or AGA Report No. 3 [2] reports a gas rate that is too high. The error is not marginal: for a rich gas at typical production pressures, condensate–gas ratios of 50 and 100 bbl/MMscf give over-readings of approximately 8% and 16% on the Chisholm multiplier. For a fiscal or allocation measurement, an error of this size is not a refinement of the uncertainty budget but its dominant term.</w:t>
       </w:r>
     </w:p>
     <w:p>
@@ -157,7 +157,7 @@
           <w:i w:val="0"/>
           <w:sz w:val="21"/>
         </w:rPr>
-        <w:t>The over-reading itself is well characterized. Murdock [3] and Chisholm [4] established the form of the two-phase multiplier for orifice plates; de Leeuw [5] and Steven [6] extended it to Venturi meters with an explicit dependence on the gas Froude number; ISO/TR 11583 [7] codifies the approach; and Alkhurayef et al. [8] review the correlation literature for Venturi meters. Later correlations have improved the treatment of the density ratio, the Froude number and the geometry, for V-cone meters at low pressure [9] and vertically mounted Venturi meters [10], and high-pressure behavior [11] and ultra-low liquid loading [12] have been examined experimentally. All of these share one structural feature. The over-reading is expressed as a function of the Lockhart–Martinelli parameter [13], which is a property of the flow rather than of the meter and which the meter does not measure. The correlations are accurate when the liquid loading is known and undefined when it is not.</w:t>
+        <w:t>The over-reading itself is well characterized. Murdock [3] and Chisholm [4] established the form of the two-phase multiplier for orifice plates; de Leeuw [5] and Steven [6] extended it to Venturi meters with an explicit dependence on the gas Froude number; ISO/TR 11583 [7] codifies the approach; and Alkhurayef et al. [8] review the correlation literature for Venturi meters. Later correlations have improved the treatment of the density ratio, the Froude number and the geometry for V-cone meters at low pressure [9] and vertically mounted Venturi meters [10], and high-pressure behavior [11] and ultra-low liquid loading [12] have been examined experimentally. All of these share one structural feature. The over-reading is expressed as a function of the Lockhart–Martinelli parameter [13], which is a property of the flow rather than of the meter and which the meter does not measure. The correlations are accurate when the liquid loading is known and undefined when it is not.</w:t>
       </w:r>
     </w:p>
     <w:p>
@@ -183,7 +183,7 @@
           <w:i w:val="0"/>
           <w:sz w:val="21"/>
         </w:rPr>
-        <w:t>The mature correlation literature therefore solves the problem of computing the correction once the liquid loading is known, whereas the practical difficulty at an installed station is the preceding step. The data-driven and hybrid methods address that step by learning the over-reading, or the flow rates, directly from experimental datasets, which must then cover the geometry, fluid and operating range of the installation. An alternative has not been examined: to learn the input of the correlation rather than its output, and to obtain that input by two independent routes, so that the disagreement between them can be measured and used to decide whether a correction should be applied at all.</w:t>
+        <w:t>The mature correlation literature therefore solves the problem of computing the correction once the liquid loading is known, whereas the practical difficulty at an installed station is the preceding step. The data-driven and hybrid methods address that step by learning the over-reading, or the flow rates, directly from experimental datasets, which must then cover the geometry, fluid and operating range of the installation. An alternative has not been examined: to learn the input of the correlation rather than its output and to obtain that input by two independent routes so that the disagreement between them can be measured and used to decide whether a correction should be applied at all.</w:t>
       </w:r>
     </w:p>
     <w:p>
@@ -196,7 +196,7 @@
           <w:i w:val="0"/>
           <w:sz w:val="21"/>
         </w:rPr>
-        <w:t>This study develops and tests such a framework for an orifice meter. The liquid loading is treated as a latent variable and estimated from information already present at the station, by a thermodynamic prediction and by an estimate from the meter's diagnostic signals, and the established correlation is retained unchanged to convert the estimate into a correction. This preserves the physical form of the correlation and its extrapolation behavior, and it confines the data-driven element to a single scalar whose uncertainty can be stated and propagated. Three questions are posed. How much of the over-reading error is removed when the liquid loading is estimated rather than measured, and how does the result decompose among the elements of the method? Under what conditions does the combination of the two estimators outperform either alone? And can the disagreement between them identify the cases in which the correction should be withheld? The answers are, respectively, that correction narrows the simulated 95% error band from ±14.94% to ±4.26%, against ±1.82% for the correlation supplied with the true liquid loading; that fusion outperforms the diagnostic estimator alone only when carryover is infrequent, when the diagnostic estimator is poorer than assumed or when it carries a persistent positive bias, and not in the reference case; and that the consistency index is a high-precision, low-sensitivity flag of gross disagreement rather than a detector of carryover.</w:t>
+        <w:t>This study develops and tests such a framework for an orifice meter. The liquid loading is treated as a latent variable and estimated from information already present at the station, by a thermodynamic prediction and by an estimate from the meter's diagnostic signals, and the established correlation is retained unchanged to convert the estimate into a correction. This preserves the physical form of the correlation and its extrapolation behavior, and it confines the data-driven element to a single scalar whose uncertainty can be stated and propagated. Three questions are posed. How much of the over-reading error is removed when the liquid loading is estimated rather than measured, and how does the result decompose among the elements of the method? Under what conditions does the combination of the two estimators outperform either alone? And can the disagreement between them identify the cases in which the correction should be withheld? The answers are, respectively, that correction narrows the simulated 95% error band from ±14.94% to ±4.26%, against ±1.82% for the correlation supplied with the true liquid loading; that fusion outperforms the diagnostic estimator alone only when carryover is infrequent, when the diagnostic estimator is poorer than assumed or when it has a persistent positive bias, and not in the reference case; and that the consistency index is a high-precision, low-sensitivity flag of gross disagreement rather than a detector of carryover.</w:t>
       </w:r>
     </w:p>
     <w:p>
@@ -209,7 +209,7 @@
           <w:i w:val="0"/>
           <w:sz w:val="21"/>
         </w:rPr>
-        <w:t>The novelty claimed is that of the integrated estimation-and-decision framework, not of any single component: the thermodynamic flash, the diagnostic regression and generalized least-squares fusion are each established. It has four parts. First, the thermodynamic estimator is given an uncertainty budget that includes the upstream carryover it cannot observe, and the study shows that inverse-variance fusion is worse than the diagnostic estimator alone without it (Section 4.2). Second, a one-sided damping rule addresses that failure mode and is compared with alternative weighting rules and thresholds, including the diagnostic estimator alone (Section 4.9). Third, a covariance-aware consistency index decides whether the correction is applied; it is characterized as a detector, and the cost of ignoring the covariance is quantified (Sections 4.3, 4.4 and 4.8). Fourth, the estimator uncertainty and an allowance for model-form error are propagated to the corrected gas rate, and the realized coverage of the declared interval is tested against an independent forward model (Section 4.11). The diagnostic estimator is specified in enough detail to be fitted and reproduced, and the code is deposited so that every number in the paper can be regenerated.</w:t>
+        <w:t>The novelty claimed is that of the integrated estimation-and-decision framework, not of any single component: the thermodynamic flash, the diagnostic regression and generalized least-squares fusion are each established. It has four parts. First, the thermodynamic estimator is given an uncertainty budget that includes the upstream carryover it cannot observe, and the study shows that inverse-variance fusion is worse than the diagnostic estimator alone without it (Section 4.2). Second, a one-sided damping rule addresses that failure mode and is compared with alternative weighting rules and thresholds, including the diagnostic estimator alone (Section 4.9). Third, a covariance-aware consistency index determines whether the correction is applied; it is characterized as a detector, and the cost of ignoring the covariance is quantified (Sections 4.3, 4.4 and 4.8). Fourth, the estimator uncertainty and an allowance for model-form error are propagated to the corrected gas rate, and the realized coverage of the declared interval is tested against an independent forward model (Section 4.11). The diagnostic estimator is specified in enough detail to be fitted and reproduced, and the code is deposited so that every number in the paper can be regenerated.</w:t>
       </w:r>
     </w:p>
     <w:p>
@@ -222,7 +222,7 @@
           <w:i w:val="0"/>
           <w:sz w:val="21"/>
         </w:rPr>
-        <w:t>The status of the results is stated at the outset. This is a model-based study. No experimental wet-gas data were used, the diagnostic estimator was specified but not fitted, and every performance figure is a modeled uncertainty conditional on the assumptions of Section 3.2, not a demonstrated measurement accuracy; Section 5.3 separates what the simulations demonstrate from what is proposed. The central hypothesis is nevertheless falsifiable. An independently trained diagnostic estimator should recover the liquid loading within the uncertainty assumed here, and disagreement between the two estimates should preferentially identify the cases in which liquid arrived from upstream rather than condensing locally. Section 5.5 specifies the loop experiment and the criteria under which the framework would be refuted.</w:t>
+        <w:t>The status of the results is stated at the outset. This is a model-based study. No experimental wet-gas data were used, the diagnostic estimator was specified but not fitted, and every performance figure is a modeled uncertainty conditional on the assumptions of Section 3.2, not a demonstrated measurement accuracy; Section 5.3 separates what the simulations demonstrate from what is proposed. The central hypothesis is nevertheless falsifiable. An independently trained diagnostic estimator should recover the liquid loading within the uncertainty assumed here, and disagreement between the two estimates should preferentially identify the cases in which the liquid arrived from upstream rather than condensing locally. Section 5.5 specifies the loop experiment and the criteria under which the framework would be refuted.</w:t>
       </w:r>
     </w:p>
     <w:p>
@@ -271,7 +271,7 @@
           <w:i w:val="0"/>
           <w:sz w:val="21"/>
         </w:rPr>
-        <w:t xml:space="preserve"> operate on different information; a fusion step combines them and quantifies their disagreement; and an acceptance test determines whether the established correction is applied. Periodic reference data act on the estimators through calibration and not on the real-time correction path.</w:t>
+        <w:t xml:space="preserve"> operate on different information; a fusion step combines them and quantifies their disagreement, and an acceptance test determines whether the established correction is applied. Periodic reference data act on the estimators through calibration and not on the real-time correction path.</w:t>
       </w:r>
     </w:p>
     <w:p>
@@ -497,7 +497,7 @@
           <w:i w:val="0"/>
           <w:sz w:val="21"/>
         </w:rPr>
-        <w:t xml:space="preserve">, while a single-phase meter supplies one measurement. The system is underdetermined, and no processing of that measurement alone resolves it. The problem addressed is therefore to estimate </w:t>
+        <w:t xml:space="preserve">, whereas a single-phase meter supplies one measurement. The system is underdetermined, and no processing of that measurement alone resolves it. The problem addressed is therefore to estimate </w:t>
       </w:r>
       <w:r>
         <w:rPr>
@@ -519,7 +519,7 @@
           <w:i w:val="0"/>
           <w:sz w:val="21"/>
         </w:rPr>
-        <w:t xml:space="preserve"> from process and meter information already available at the station, to quantify the uncertainty of that estimate, and to propagate it to a defensible uncertainty on the corrected gas rate.</w:t>
+        <w:t xml:space="preserve"> from process and meter information already available at the station to quantify the uncertainty of that estimate and to propagate it to a defensible uncertainty on the corrected gas rate.</w:t>
       </w:r>
     </w:p>
     <w:p>
@@ -532,7 +532,7 @@
           <w:i w:val="0"/>
           <w:sz w:val="21"/>
         </w:rPr>
-        <w:t>The Chisholm multiplier, Eq. (4), is the correction model for the orifice case throughout; the de Leeuw form, with its Froude-dependent exponent, is available for Venturi and cone geometries. The choice of correlation is not the subject of the study, since the estimator developed below supplies the input that any of them requires. The model that generates the simulated meter reading is a separate choice, and Section 3.2 varies it.</w:t>
+        <w:t>The Chisholm multiplier, Eq. (4), is the correction model for the orifice case throughout; the de Leeuw form, with its Froude-dependent exponent, is available for the Venturi and cone geometries. The choice of correlation is not the subject of the study, since the estimator developed below supplies the input that any of them requires. The model that generates the simulated meter reading is a separate choice, and Section 3.2 varies it.</w:t>
       </w:r>
     </w:p>
     <w:p>
@@ -594,7 +594,7 @@
           <w:i w:val="0"/>
           <w:sz w:val="21"/>
         </w:rPr>
-        <w:t>One failure mode is systematic and unidirectional at the population level, and it is treated separately. A flash calculation represents the liquid that the local stream should drop under the stated conditions. It does not represent liquid introduced from upstream, by carryover past a separator or re-entrainment from a low point, because that liquid is not a thermodynamic property of the local stream. The dominant unmodeled failure of the thermodynamic estimator is therefore underestimation caused by externally introduced liquid. This is a statement about one mechanism, not a claim that the calculation cannot err in the other direction for the reasons listed above.</w:t>
+        <w:t>One failure mode is systematic and unidirectional at the population level, and it is treated separately. A flash calculation represents the liquid that the local stream should drop under the stated conditions. It does not represent liquid introduced from upstream, by carryover past a separator or re-entrainment from a low point, because that liquid is not a thermodynamic property of the local stream. The dominant unmodeled failure of the thermodynamic estimator is therefore an underestimation caused by externally introduced liquid. This is a statement about one mechanism, not a claim that the calculation cannot err in the other direction for the reasons listed above.</w:t>
       </w:r>
     </w:p>
     <w:p>
@@ -643,7 +643,7 @@
           <w:i w:val="0"/>
           <w:sz w:val="21"/>
         </w:rPr>
-        <w:t xml:space="preserve"> over the averaging window, the permanent pressure loss ratio PLR where a downstream tapping exists, the indicated rate and the gas density, and the mapping to </w:t>
+        <w:t xml:space="preserve"> over the averaging window, the permanent pressure loss ratio PLR where downstream tapping exists, the indicated rate and the gas density, and the mapping to </w:t>
       </w:r>
       <w:r>
         <w:rPr>
@@ -678,7 +678,7 @@
           <w:i w:val="0"/>
           <w:sz w:val="21"/>
         </w:rPr>
-        <w:t>The thermodynamic estimate is deliberately excluded from the diagnostic features. Including it would allow the mapping to learn where the thermodynamic prediction is reliable, but it would also correlate the two estimates, and Section 4.4 shows that such correlation degrades the acceptance test on which the architecture depends. The two estimators are therefore structurally distinct by construction. They are not guaranteed to be statistically independent, because both respond to pressure, temperature and gas density, and the covariance between them is retained explicitly in the fusion (Section 3) rather than assumed away.</w:t>
+        <w:t>The thermodynamic estimate is deliberately excluded from the diagnostic features. Including it would allow the mapping to learn where the thermodynamic prediction is reliable, but it would also correlate the two estimates, and Section 4.4 shows that such correlation degrades the acceptance test on which the architecture depends. The two estimators are therefore structurally distinct by construction. They are not guaranteed to be statistically independent because both respond to pressure, temperature and gas density, and the covariance between them is retained explicitly in the fusion (Section 3) rather than assumed away.</w:t>
       </w:r>
     </w:p>
     <w:p>
@@ -691,7 +691,7 @@
           <w:i w:val="0"/>
           <w:sz w:val="21"/>
         </w:rPr>
-        <w:t>The diagnostic model is not fitted in this study. It is, however, specified in enough detail to be fitted and reproduced (Table 1), because an estimator that cannot be reproduced cannot be falsified.</w:t>
+        <w:t>The diagnostic model is not fitted in this study. It is, however, specified in enough detail to be fitted and reproduced (Table 1) because an estimator that cannot be reproduced cannot be falsified.</w:t>
       </w:r>
     </w:p>
     <w:tbl>
@@ -1473,7 +1473,7 @@
           <w:i w:val="0"/>
           <w:sz w:val="21"/>
         </w:rPr>
-        <w:t xml:space="preserve">The specification yields a calibrated predictive interval rather than a standard deviation, and the two are related as follows. For approximately normal residuals the calibrated 90% interval </w:t>
+        <w:t xml:space="preserve">The specification yields a calibrated predictive interval rather than a standard deviation, and the two are related as follows. For approximately normal residuals, the calibrated 90% interval </w:t>
       </w:r>
       <w:r>
         <w:rPr>
@@ -1626,7 +1626,7 @@
           <w:i w:val="0"/>
           <w:sz w:val="21"/>
         </w:rPr>
-        <w:t xml:space="preserve">. For non-normal residuals the conformal interval [23] remains the primary statement of uncertainty, and </w:t>
+        <w:t xml:space="preserve">. For nonnormal residuals, the conformal interval [23] remains the primary statement of uncertainty, and </w:t>
       </w:r>
       <w:r>
         <w:rPr>
@@ -1661,7 +1661,7 @@
           <w:i w:val="0"/>
           <w:sz w:val="21"/>
         </w:rPr>
-        <w:t>Two further components of the diagnostic uncertainty are distinguished. The random relative uncertainty, assumed at 20%, is the scatter of a single reading about the mapping. The transfer bias, assumed at 6%, is the standard deviation across installations of the offset between the mapping fitted at a loop and the mapping at a site. A persistent offset at one site does not average out over a population of sites, and it is evaluated separately in Section 4.10. Section 5.4 identifies the assumed performance of the diagnostic estimator as the most consequential assumption of the paper.</w:t>
+        <w:t>Two further components of diagnostic uncertainty are distinguished. The random relative uncertainty, assumed at 20%, is the scatter of a single reading about the mapping. The transfer bias, assumed at 6%, is the standard deviation across installations of the offset between the mapping fitted at a loop and the mapping at a site. A persistent offset at one site does not average out over a population of sites, and it is evaluated separately in Section 4.10. Section 5.4 identifies the assumed performance of the diagnostic estimator as the most consequential assumption of the paper.</w:t>
       </w:r>
     </w:p>
     <w:p>
@@ -1710,7 +1710,7 @@
           <w:i w:val="0"/>
           <w:sz w:val="21"/>
         </w:rPr>
-        <w:t xml:space="preserve"> between their errors is estimated. They are not real-time inputs, because test separators carry uncertainties of several percent: admitted at every cycle they would inject that uncertainty into each reading, whereas averaged over many runs they constrain a slowly varying offset effectively.</w:t>
+        <w:t xml:space="preserve"> between their errors is estimated. They are not real-time inputs because test separators carry uncertainties of several percent: admitted at every cycle, they would inject that uncertainty into each reading, whereas averaged over many runs, they constrain a slowly varying offset effectively.</w:t>
       </w:r>
     </w:p>
     <w:p>
@@ -1723,7 +1723,7 @@
           <w:i w:val="0"/>
           <w:sz w:val="21"/>
         </w:rPr>
-        <w:t xml:space="preserve">In real time the two estimates are combined by generalized least squares, with the weight of the thermodynamic estimate damped when the diagnostic estimate exceeds it significantly, which is the signature of carryover, and their disagreement is expressed as a consistency index </w:t>
+        <w:t xml:space="preserve">In real time, the two estimates are combined by generalized least squares, with the weight of the thermodynamic estimate damped when the diagnostic estimate exceeds it significantly, which is the signature of carryover, and their disagreement is expressed as a consistency index </w:t>
       </w:r>
       <w:r>
         <w:rPr>
@@ -1773,7 +1773,7 @@
           <w:i w:val="0"/>
           <w:sz w:val="21"/>
         </w:rPr>
-        <w:t xml:space="preserve">, the established correlation is applied to the fused liquid loading and the corrected rate is published with its expanded uncertainty, the fused liquid loading and </w:t>
+        <w:t xml:space="preserve">, the established correlation is applied to the fused liquid loading, and the corrected rate is published with its expanded uncertainty, the fused liquid loading and </w:t>
       </w:r>
       <w:r>
         <w:rPr>
@@ -1787,7 +1787,7 @@
           <w:i w:val="0"/>
           <w:sz w:val="21"/>
         </w:rPr>
-        <w:t>. Otherwise the indicated rate is published unchanged with a low-confidence status. The method therefore declines to answer, rather than answering unreliably, when its assumptions are not met. The equations of each step are given in Section 3.</w:t>
+        <w:t>. Otherwise, the indicated rate is published unchanged with a low-confidence status. The method therefore declines to answer, rather than answering unreliably, when its assumptions are not met. The equations of each step are given in Section 3.</w:t>
       </w:r>
     </w:p>
     <w:p>
@@ -2674,7 +2674,7 @@
           <w:i w:val="0"/>
           <w:sz w:val="21"/>
         </w:rPr>
-        <w:t xml:space="preserve">Here </w:t>
+        <w:t xml:space="preserve">Here, </w:t>
       </w:r>
       <w:r>
         <w:rPr>
@@ -2718,7 +2718,7 @@
           <w:i w:val="0"/>
           <w:sz w:val="21"/>
         </w:rPr>
-        <w:t xml:space="preserve"> are the liquid and gas mass flow rates, </w:t>
+        <w:t xml:space="preserve"> are the liquid and gas mass flow rates, respectively; </w:t>
       </w:r>
       <w:r>
         <w:rPr>
@@ -2762,7 +2762,7 @@
           <w:i w:val="0"/>
           <w:sz w:val="21"/>
         </w:rPr>
-        <w:t xml:space="preserve"> the liquid and gas densities, and </w:t>
+        <w:t xml:space="preserve"> the liquid and gas densities, respectively; and </w:t>
       </w:r>
       <w:r>
         <w:rPr>
@@ -2784,7 +2784,7 @@
           <w:i w:val="0"/>
           <w:sz w:val="21"/>
         </w:rPr>
-        <w:t xml:space="preserve"> the gas densiometric Froude number. The thermodynamic estimate, the diagnostic feature vector and the diagnostic estimate are as follows:</w:t>
+        <w:t xml:space="preserve"> the gas densiometric Froude number. The thermodynamic estimate, diagnostic feature vector and diagnostic estimate are as follows:</w:t>
       </w:r>
     </w:p>
     <w:p>
@@ -3959,7 +3959,7 @@
           <w:i w:val="0"/>
           <w:sz w:val="21"/>
         </w:rPr>
-        <w:t>The asymmetric damping of the thermodynamic weight, and the fused value and uncertainty recomputed from the renormalized weights, are as follows:</w:t>
+        <w:t>The asymmetric damping of the thermodynamic weight and the fused value and uncertainty recomputed from the renormalized weights are as follows:</w:t>
       </w:r>
     </w:p>
     <w:p>
@@ -5814,7 +5814,7 @@
           <w:i w:val="0"/>
           <w:sz w:val="21"/>
         </w:rPr>
-        <w:t>; the mean shift is the task of the damping rule and not of the budget. The term is not optional. Section 4.2 shows that omitting it makes the fused estimate worse than the diagnostic estimate alone, because the weighting then over-trusts the thermodynamic estimator.</w:t>
+        <w:t>; the mean shift is the task of the damping rule and not of the budget. The term is not optional. Section 4.2 shows that omitting it makes the fused estimate worse than the diagnostic estimate alone because the weighting then over-trusts the thermodynamic estimator.</w:t>
       </w:r>
     </w:p>
     <w:p>
@@ -6024,7 +6024,7 @@
           <w:i w:val="0"/>
           <w:sz w:val="21"/>
         </w:rPr>
-        <w:t xml:space="preserve"> too small, and the acceptance test becomes progressively less sensitive; Section 4.4 quantifies the effect. In practice </w:t>
+        <w:t xml:space="preserve"> too small, and the acceptance test becomes progressively less sensitive; Section 4.4 quantifies the effect. In practice, </w:t>
       </w:r>
       <w:r>
         <w:rPr>
@@ -6059,7 +6059,7 @@
           <w:i w:val="0"/>
           <w:sz w:val="21"/>
         </w:rPr>
-        <w:t xml:space="preserve">The one-sided form of Eq. (12) follows from the failure mode of Section 2.2. A carryover fraction cannot be negative, so the thermodynamic estimate can fall below the true value because of upstream liquid but cannot rise above it for that reason. A large positive excess </w:t>
+        <w:t xml:space="preserve">The one-sided form of Eq. (12) follows from the failure mode of Section 2.2. A carryover fraction cannot be negative, so the thermodynamic estimate can fall below the true value because of the upstream liquid but cannot rise above it for that reason. A large positive excess </w:t>
       </w:r>
       <w:r>
         <w:rPr>
@@ -6230,7 +6230,7 @@
           <w:i w:val="0"/>
           <w:sz w:val="21"/>
         </w:rPr>
-        <w:t xml:space="preserve"> is the number of combined standard uncertainties of excess tolerated before the thermodynamic estimate is down-weighted. It is set to </w:t>
+        <w:t xml:space="preserve"> is the number of combined standard uncertainties of excess tolerated before the thermodynamic estimate is downweighted. It is set to </w:t>
       </w:r>
       <w:r>
         <w:rPr>
@@ -6475,7 +6475,7 @@
           <w:i w:val="0"/>
           <w:sz w:val="21"/>
         </w:rPr>
-        <w:t xml:space="preserve"> exceeds the undamped value, which is intended, since the damping is triggered by evidence that </w:t>
+        <w:t xml:space="preserve"> exceeds the undamped value, which is intended since the damping is triggered by evidence that </w:t>
       </w:r>
       <w:r>
         <w:rPr>
@@ -6519,7 +6519,7 @@
           <w:i w:val="0"/>
           <w:sz w:val="21"/>
         </w:rPr>
-        <w:t xml:space="preserve"> would be indefensible. The sensitivity of the results to this choice is small, because the acceptance test removes the cases in which the inflation would be greatest.</w:t>
+        <w:t xml:space="preserve"> would be indefensible. The sensitivity of the results to this choice is small because the acceptance test removes the cases in which inflation would be greatest.</w:t>
       </w:r>
     </w:p>
     <w:p>
@@ -6554,7 +6554,7 @@
           <w:i w:val="0"/>
           <w:sz w:val="21"/>
         </w:rPr>
-        <w:t xml:space="preserve">, which carries </w:t>
+        <w:t xml:space="preserve">, which has </w:t>
       </w:r>
       <w:r>
         <w:rPr>
@@ -6670,7 +6670,7 @@
           <w:i w:val="0"/>
           <w:sz w:val="21"/>
         </w:rPr>
-        <w:t xml:space="preserve"> is an allowance for the difference between the correlation and the true over-reading, arising from departures from the Chisholm form, the geometry and the flow regime. It is zero in the reference case, where the forward and correction models coincide, and in the model-form scenarios of Section 4.11 it is declared as a relative uncertainty of the over-reading, </w:t>
+        <w:t xml:space="preserve"> is an allowance for the difference between the correlation and the true over-reading, arising from departures from the Chisholm form, the geometry and the flow regime. It is zero in the reference case, where the forward and correction models coincide, and in the model-form scenarios of Section 4.11, it is declared as a relative uncertainty of the over-reading, </w:t>
       </w:r>
       <w:r>
         <w:rPr>
@@ -6789,7 +6789,7 @@
           <w:i w:val="0"/>
           <w:sz w:val="21"/>
         </w:rPr>
-        <w:t xml:space="preserve">Equations (1)–(17) are not presented as new physics, and they differ in provenance, which is stated here and summarized in Table A1 (Appendix A). Three classes are distinguished. Established relations are the definition of the over-reading and its inverse, Eqs. (1) and (2), as codified in ISO/TR 11583 [7]; the Lockhart–Martinelli parameter, Eq. (3) [13]; the minimum-variance combination of two correlated estimates and the normalized difference between them, Eqs. (9)–(11); first-order propagation of uncertainty, Eqs. (15) and (16) [24]; and the relative error of Eq. (17). Adapted relations are taken from the literature and used within the limits stated for each: the Chisholm multiplier of Eq. (4) [4], with </w:t>
+        <w:t xml:space="preserve">Equations (1)–(17) are not presented as new physics, and they differ in provenance, which is stated here and summarized in Table A1 (Appendix A). Three classes are distinguished. Established relations are the definition of the over-reading and its inverse, Eqs. (1) and (2), as codified in ISO/TR 11583 [7]; the Lockhart–Martinelli parameter, Eq. (3) [13]; the minimum-variance combination of two correlated estimates and the normalized difference between them, Eqs. (9)–(11); the first-order propagation of uncertainty, Eqs. (15) and (16) [24]; and the relative error of Eq. (17). Adapted relations are taken from the literature and used within the limits stated for each: the Chisholm multiplier of Eq. (4) [4], with </w:t>
       </w:r>
       <w:r>
         <w:rPr>
@@ -6837,7 +6837,7 @@
           <w:i w:val="0"/>
           <w:sz w:val="21"/>
         </w:rPr>
-        <w:t>; the first-order propagation of the liquid-loading term agrees with Monte Carlo propagation to within 0.42% (Table A2). The uncertainties, biases, carryover statistics and correlations that enter the equations are inputs, assumed and then swept (Table 2); none was fitted to loop data, and none is described as calibrated. The equations have not been validated against wet-gas measurements, which is why Section 5.5 specifies the experiment that would do so.</w:t>
+        <w:t>; the first-order propagation of the liquid-loading term agrees with the Monte Carlo propagation to within 0.42% (Table A2). The uncertainties, biases, carryover statistics and correlations that enter the equations are inputs, assumed and then swept (Table 2); none was fitted to loop data, and none is described as calibrated. The equations have not been validated against wet-gas measurements, which is why Section 5.5 specifies the experiment that would do so.</w:t>
       </w:r>
     </w:p>
     <w:p>
@@ -6864,7 +6864,7 @@
           <w:i w:val="0"/>
           <w:sz w:val="21"/>
         </w:rPr>
-        <w:t>The Monte Carlo analysis is probabilistic propagation of the input distributions through the deterministic model of Eqs. (1)–(16), in the sense of JCGM 101 [28]; it is not a simulation of two-phase hydrodynamics or of the meter's internal flow. For each realization the operating conditions, the true liquid loading, the carryover state and the errors of both estimators are drawn from the distributions of Table 2, the indicated rate is generated with the forward model, the method is applied, and the corrected rate is compared with the true one. Gas density is computed from Standing pseudo-critical properties with the Dranchuk and Abou-Kassem Z-factor correlation [29], which over the sampled envelope returns 48.5–85.5 kg/m³ and Z of 0.785–0.889. Pressures are given in kgf/cm² (1 kgf/cm² = 0.0980665 MPa), so the envelope of 60–85 kgf/cm² is 5.9–8.3 MPa. The transfer bias of the diagnostic estimator and the correlation residual are drawn independently for each realization, so that the reported statistics integrate over a population of installations; a persistent bias at one installation is evaluated separately in Section 4.10.</w:t>
+        <w:t>The Monte Carlo analysis is probabilistic propagation of the input distributions through the deterministic model of Eqs. (1)–(16), in the sense of JCGM 101 [28]; it is not a simulation of two-phase hydrodynamics or of the meter's internal flow. For each realization the operating conditions, the true liquid loading, the carryover state and the errors of both estimators are drawn from the distributions of Table 2, the indicated rate is generated with the forward model, the method is applied, and the corrected rate is compared with the true one. Gas density is computed from Standing pseudo-critical properties with the Dranchuk and Abou-Kassem Z-factor correlation [29], which over the sampled envelope returns 48.5–85.5 kg/m³ and Z of 0.785–0.889. Pressures are given in kgf/cm² (1 kgf/cm² = 0.0980665 MPa), so the envelope of 60–85 kgf/cm² is 5.9–8.3 MPa. The transfer bias of the diagnostic estimator and the correlation residual are drawn independently for each realization so that the reported statistics integrate over a population of installations; a persistent bias at one installation is evaluated separately in Section 4.10.</w:t>
       </w:r>
     </w:p>
     <w:tbl>
@@ -8331,7 +8331,7 @@
           <w:i w:val="0"/>
           <w:sz w:val="21"/>
         </w:rPr>
-        <w:t>Two samples are used. The ablation, the behavior of the consistency index, the correlation, prevalence and sensitivity analyses and the admissibility map (Sections 4.2–4.7) are computed with 300,000 realizations per configuration and 4,000 per envelope cell, with fixed seeds (20260915 for the main study and 20260916 for the correlated-estimator study). The threshold table of Section 4.3, the detector characterization, the comparison of weighting rules, the robustness tests and the independent forward model (Sections 4.8–4.11) use common random numbers: every random primitive is drawn once (300,000 realizations, seed 20261027) and reused for every configuration compared, so that a difference between two methods is a difference between methods and not between samples. With the baseline settings the second sample reproduces the ablation of Table 3 to within 0.030 percentage points, twice the sampling error of a band.</w:t>
+        <w:t>Two samples are used. The ablation, the behavior of the consistency index, the correlation, prevalence and sensitivity analyses and admissibility map (Sections 4.2–4.7) are computed with 300,000 realizations per configuration and 4,000 per envelope cell, with fixed seeds (20260915 for the main study and 20260916 for the correlated-estimator study). The threshold table of Section 4.3, the detector characterization, the comparison of weighting rules, the robustness tests and the independent forward model (Sections 4.8–4.11) use common random numbers: every random primitive is drawn once (300,000 realizations, seed 20261027) and reused for every configuration compared so that a difference between the two methods is a difference between methods and not between samples. With the baseline settings, the second sample reproduces the ablation of Table 3 to within 0.030 percentage points, twice the sampling error of a band.</w:t>
       </w:r>
     </w:p>
     <w:p>
@@ -8344,7 +8344,7 @@
           <w:i w:val="0"/>
           <w:sz w:val="21"/>
         </w:rPr>
-        <w:t xml:space="preserve">The correction model is always the Chisholm multiplier of Eq. (4), but the model that generates the simulated meter reading is varied in three ways. In the matched case, which is the reference, it is the Chisholm multiplier itself. In the independent case it is the orifice correlation of Murdock [3], </w:t>
+        <w:t xml:space="preserve">The correction model is always the Chisholm multiplier of Eq. (4), but the model that generates the simulated meter reading is varied in three ways. In the matched case, which is the reference, it is the Chisholm multiplier itself. In the independent case, it is the orifice correlation of Murdock [3], </w:t>
       </w:r>
       <w:r>
         <w:rPr>
@@ -8380,7 +8380,7 @@
           <w:i w:val="0"/>
           <w:sz w:val="21"/>
         </w:rPr>
-        <w:t xml:space="preserve">, a separately published correlation for the same meter type. In the perturbed cases the over-reading </w:t>
+        <w:t xml:space="preserve">, a separately published correlation for the same meter type. In the perturbed cases, the over-reading </w:t>
       </w:r>
       <w:r>
         <w:rPr>
@@ -8550,7 +8550,7 @@
           <w:i w:val="0"/>
           <w:sz w:val="21"/>
         </w:rPr>
-        <w:t>The reported metrics are the mean error (bias), the mean absolute error, the root-mean-square error, the maximum absolute error and the 95% error band, defined as the larger absolute value of the 2.5th and 97.5th percentiles of the simulated error. For configurations that include the acceptance test the metrics are computed over the accepted realizations, and the acceptance rate is reported alongside, because the output of the method on a rejected realization is the uncorrected value with a flag rather than a corrected value.</w:t>
+        <w:t>The reported metrics are the mean error (bias), the mean absolute error, the root-mean-square error, the maximum absolute error and the 95% error band, defined as the larger absolute value of the 2.5th and 97.5th percentiles of the simulated error. For configurations that include the acceptance test, the metrics are computed over the accepted realizations, and the acceptance rate is reported alongside because the output of the method on a rejected realization is the uncorrected value with a flag rather than a corrected value.</w:t>
       </w:r>
     </w:p>
     <w:p>
@@ -8563,7 +8563,7 @@
           <w:i w:val="0"/>
           <w:sz w:val="21"/>
         </w:rPr>
-        <w:t xml:space="preserve">The terms are used as follows. Error is the simulated deviation of an estimate from the reference, Eq. (17), and bias is its mean over the realizations. Uncertainty is a standard uncertainty declared by the method in the sense of JCGM 100 [24], </w:t>
+        <w:t xml:space="preserve">The terms are used as follows. Error is the simulated deviation of an estimate from the reference, Eq. (17), and the bias is its mean over the realizations. Uncertainty is a standard uncertainty declared by the method in the sense of JCGM 100 [24], </w:t>
       </w:r>
       <w:r>
         <w:rPr>
@@ -8619,7 +8619,7 @@
           <w:i w:val="0"/>
           <w:sz w:val="21"/>
         </w:rPr>
-        <w:t xml:space="preserve"> is reported separately (Section 4.11). Accuracy is not used for simulated quantities, because it presupposes a measured reference. The sampling error of a band over 300,000 realizations is 0.015 percentage points (standard error from ten batches), which is the resolution below which differences between bands should not be interpreted. For the consistency test a rejected realization is a positive, and two conditions are used as targets: the presence of upstream carryover, the failure mode the test is designed for, and a consequential corrected-rate error, defined as an absolute error above 3%. Sensitivity, specificity, precision and false-positive rate are defined in the usual way from the counts of true and false positives and negatives [30].</w:t>
+        <w:t xml:space="preserve"> is reported separately (Section 4.11). Accuracy is not used for simulated quantities because it presupposes a measured reference. The sampling error of a band over 300,000 realizations is 0.015 percentage points (standard error from ten batches), which is the resolution below which differences between bands should not be interpreted. For the consistency test, a rejected realization is a positive, and two conditions are used as targets: the presence of upstream carryover, the failure mode the test is designed for, and a consequential corrected-rate error, defined as an absolute error above 3%. Sensitivity, specificity, precision and false-positive rate are defined in the usual way from the counts of true and false positives and negatives [30].</w:t>
       </w:r>
     </w:p>
     <w:p>
@@ -8632,7 +8632,7 @@
           <w:i w:val="0"/>
           <w:sz w:val="21"/>
         </w:rPr>
-        <w:t>Nine executable checks of the implementation are reported in Table A2. They confirm that the two samples agree, that the fusion and damping equations reduce to their closed-form limits, that the detector statistics and the correlated-error generator are correct, and that the first-order propagation of Eq. (16) agrees with Monte Carlo propagation to within 0.42%. They establish internal consistency and convergence, not validity against a wet-gas loop.</w:t>
+        <w:t>Nine executable checks of the implementation are reported in Table A2. They confirm that the two samples agree that the fusion and damping equations reduce to their closed-form limits, that the detector statistics and the correlated-error generator are correct and that the first-order propagation of Eq. (16) agrees with Monte Carlo propagation to within 0.42%. They establish internal consistency and convergence, not validity against a wet-gas loop.</w:t>
       </w:r>
     </w:p>
     <w:p>
@@ -8686,7 +8686,7 @@
           <w:i w:val="0"/>
           <w:sz w:val="21"/>
         </w:rPr>
-        <w:t>At representative envelope conditions, condensate–gas ratios of 50 and 100 bbl/MMscf give over-readings of 7.9% and 15.7%, and the simulated population mean over-reading across the envelope is +7.94%, with a 95% band of ±14.94%. These magnitudes are consistent with the uncorrected errors reported for differential-pressure meters in wet gas, which is a necessary check on everything downstream.</w:t>
+        <w:t>At representative envelope conditions, the condensate–gas ratios of 50 and 100 bbl/MMscf give over-readings of 7.9% and 15.7%, respectively, and the simulated population mean over-reading across the envelope is +7.94%, with a 95% band of ±14.94%. These magnitudes are consistent with the uncorrected errors reported for differential-pressure meters in wet gas, which is a necessary check on everything downstream.</w:t>
       </w:r>
     </w:p>
     <w:p>
@@ -9994,7 +9994,7 @@
           <w:i w:val="0"/>
           <w:sz w:val="21"/>
         </w:rPr>
-        <w:t xml:space="preserve"> the acceptance test does not measurably narrow the band. The simulated bias falls from +7.94% uncorrected to +0.58%.</w:t>
+        <w:t>, the acceptance test does not measurably narrow the band. The simulated bias decreases from +7.94% uncorrected to +0.58%.</w:t>
       </w:r>
     </w:p>
     <w:p>
@@ -10007,7 +10007,7 @@
           <w:i w:val="0"/>
           <w:sz w:val="21"/>
         </w:rPr>
-        <w:t>The gap to the oracle remains substantial, ±4.26% against ±1.82%, and no amount of fusion closes it: estimating the liquid loading rather than measuring it costs roughly a factor of two in the error band. Moreover, in the reference case the diagnostic estimator alone (±3.99%) is narrower than every fused configuration of Table 3, including the full method. Fusion is therefore not claimed to outperform it here, and Sections 4.5, 4.9 and 4.10 establish the conditions under which it does: infrequent carryover, a poor diagnostic estimator, or a persistent bias in it. The distributions behind these figures are shown in Fig. 3; the uncorrected distribution is strictly positive, because the wet-gas over-reading has a sign.</w:t>
+        <w:t>The gap to the oracle remains substantial, ±4.26% against ±1.82%, and no amount of fusion closes it: estimating the liquid loading rather than measuring it costs roughly a factor of two in the error band. Moreover, in the reference case, the diagnostic estimator alone (±3.99%) is narrower than every fused configuration of Table 3, including the full method. Fusion is therefore not claimed to outperform it here, and Sections 4.5, 4.9 and 4.10 establish the conditions under which it does: infrequent carryover, a poor diagnostic estimator, or a persistent bias in it. The distributions behind these figures are shown in Fig. 3; the uncorrected distribution is strictly positive because the wet-gas over-reading has a sign.</w:t>
       </w:r>
     </w:p>
     <w:p>
@@ -10113,7 +10113,7 @@
           <w:i/>
           <w:sz w:val="18"/>
         </w:rPr>
-        <w:t>Fig. 3. Simulated error distribution of the gas rate before and after correction. The uncorrected distribution is strictly positive because the wet-gas over-reading has a sign.</w:t>
+        <w:t>Fig. 3. Simulated error distribution of the gas rate before and after correction. The uncorrected distribution is strictly positive because wet-gas over-reading has a sign.</w:t>
       </w:r>
     </w:p>
     <w:p>
@@ -10140,7 +10140,7 @@
           <w:i w:val="0"/>
           <w:sz w:val="21"/>
         </w:rPr>
-        <w:t>Upstream carryover is present in 25% of the simulated realizations, in 24% of the accepted realizations and in 94% of the rejected ones (Fig. 4). The 94% is the precision of the rejection decision, that is, the share of rejected realizations that contain carryover; it is not a specificity, and it depends on the prevalence of carryover. At the threshold adopted here the test rejects very few realizations and nearly all of those contain carryover, but it misses most of the carryover that is present, and Table 4 gives the full behavior of the test over the threshold.</w:t>
+        <w:t>Upstream carryover is present in 25% of the simulated realizations, in 24% of the accepted realizations and in 94% of the rejected ones (Fig. 4). The 94% is the precision of the rejection decision, that is, the share of rejected realizations that contain carryover; it is not a specificity, and it depends on the prevalence of carryover. At the threshold adopted here, the test rejects very few realizations, and nearly all of those contain carryover, but it misses most of the carryover that is present, and Table 4 gives the full behavior of the test over the threshold.</w:t>
       </w:r>
     </w:p>
     <w:p>
@@ -11265,7 +11265,7 @@
           <w:i/>
           <w:sz w:val="18"/>
         </w:rPr>
-        <w:t>Table 4. Simulated effect of the acceptance threshold on the retained data and on the detection of upstream carryover (a rejected realization is a positive). Sensitivity, specificity, precision and false-positive rate refer to the presence of carryover in any amount. Common random numbers (Section 3.2).</w:t>
+        <w:t>Table 4. Simulated effect of the acceptance threshold on the retained data and on the detection of upstream carryover (a rejected realization is positive). Sensitivity, specificity, precision and false-positive rate refer to the presence of carryover in any amount. Common random numbers (Section 3.2).</w:t>
       </w:r>
     </w:p>
     <w:p>
@@ -11307,7 +11307,7 @@
           <w:i w:val="0"/>
           <w:sz w:val="21"/>
         </w:rPr>
-        <w:t xml:space="preserve">, the false-positive rate is 0.05% and 0.8% of all realizations are rejected, but only 2.9% of the realizations that contain carryover are detected. This is a completeness-priority setting that removes gross disagreement and almost nothing else. If the priority is to catch carryover, </w:t>
+        <w:t xml:space="preserve">, the false-positive rate is 0.05% and 0.8% of all the realizations are rejected, but only 2.9% of the realizations that contain carryover are detected. This is a completeness-priority setting that removes gross disagreement and almost nothing else. If the priority is to catch carryover, </w:t>
       </w:r>
       <w:r>
         <w:rPr>
@@ -11336,7 +11336,7 @@
           <w:i w:val="0"/>
           <w:sz w:val="21"/>
         </w:rPr>
-        <w:t xml:space="preserve"> detects 71% of it, at the cost of rejecting 21% of the realizations that contain none (precision 53%) and 34% of all realizations. The appropriate value at a given installation depends on whether a narrow error band or completeness has priority, and on the cost of each kind of error.</w:t>
+        <w:t xml:space="preserve"> detects 71% of it, at the cost of rejecting 21% of the realizations that contain none (precision 53%) and 34% of all realizations. The appropriate value at a given installation depends on whether a narrow error band or completeness has priority and on the cost of each kind of error.</w:t>
       </w:r>
     </w:p>
     <w:p>
@@ -11407,7 +11407,7 @@
           <w:i w:val="0"/>
           <w:sz w:val="21"/>
         </w:rPr>
-        <w:t xml:space="preserve"> from 0 to 0.7 and compare a consistency index that assumes independence with one that retains the covariance term.</w:t>
+        <w:t xml:space="preserve"> from 0 to 0.7, and compare a consistency index that assumes independence with one that retains the covariance term.</w:t>
       </w:r>
     </w:p>
     <w:tbl>
@@ -11976,7 +11976,7 @@
           <w:i w:val="0"/>
           <w:sz w:val="21"/>
         </w:rPr>
-        <w:t xml:space="preserve"> the rejection rate falls to 0.2%, against 8.2% when the covariance is retained, and at </w:t>
+        <w:t xml:space="preserve">, the rejection rate decreases to 0.2%, against 8.2% when the covariance is retained, and at </w:t>
       </w:r>
       <w:r>
         <w:rPr>
@@ -12034,7 +12034,7 @@
           <w:i w:val="0"/>
           <w:sz w:val="21"/>
         </w:rPr>
-        <w:t xml:space="preserve"> it is 2.9% at </w:t>
+        <w:t xml:space="preserve">, it is 2.9% at </w:t>
       </w:r>
       <w:r>
         <w:rPr>
@@ -12092,7 +12092,7 @@
           <w:i w:val="0"/>
           <w:sz w:val="21"/>
         </w:rPr>
-        <w:t xml:space="preserve"> and 0.6 when the covariance is retained, against 2.0% and 1.0% when it is ignored; retaining the covariance makes the test more sensitive as the estimates become more correlated, because their difference then carries less noise.</w:t>
+        <w:t xml:space="preserve"> and 0.6 when the covariance is retained, against 2.0% and 1.0% when it is ignored; retaining the covariance makes the test more sensitive as the estimates become more correlated because their difference then carries less noise.</w:t>
       </w:r>
     </w:p>
     <w:p>
@@ -12105,7 +12105,7 @@
           <w:i w:val="0"/>
           <w:sz w:val="21"/>
         </w:rPr>
-        <w:t xml:space="preserve">For the point estimate the effect is different and smaller. Generalized least-squares weights are minimum-variance but not minimum-error when one estimator has an unmodeled bias, and in this regime the error is bias-dominated, so the covariance-aware weights give a slightly wider band at high </w:t>
+        <w:t xml:space="preserve">For the point estimate, the effect is different and smaller. Generalized least-squares weights are minimum-variance but not minimum-error when one estimator has an unmodeled bias, and in this regime, the error is bias-dominated, so the covariance-aware weights give a slightly wider band at high </w:t>
       </w:r>
       <w:r>
         <w:rPr>
@@ -12302,7 +12302,7 @@
           <w:i w:val="0"/>
           <w:sz w:val="21"/>
         </w:rPr>
-        <w:t>The value of combining the two estimators depends on how often the thermodynamic one is blind, and Fig. 6 varies the carryover prevalence from 0 to 60% of the operating time. With no carryover the thermodynamic estimator is the better of the two (±2.70% against ±4.04%), and the method correctly falls back toward it (±2.72%). Between approximately 5% and 15% prevalence the fused estimate is narrower than either estimator alone. A finer sweep with common random numbers (Section 4.10) finds that the asymmetric rule remains narrower than the diagnostic estimator alone up to a prevalence of 15%, and the full method up to 16%. Beyond that the diagnostic estimator is the narrower, by 0.3 percentage points at the reference prevalence of 25% and by about 0.8 at 60%, because the thermodynamic estimate is wrong too often to contribute.</w:t>
+        <w:t>The value of combining the two estimators depends on how often the thermodynamic one is blind, and Fig. 6 varies the carryover prevalence from 0 to 60% of the operating time. With no carryover, the thermodynamic estimator is the better of the two (±2.70% against ±4.04%), and the method correctly falls back toward it (±2.72%). Between approximately 5% and 15% prevalence, the fused estimate is narrower than either estimator alone. A finer sweep with common random numbers (Section 4.10) reveals that the asymmetric rule remains narrower than the diagnostic estimator alone up to a prevalence of 15%, and the full method up to 16%. Beyond that, the diagnostic estimator is narrower, by 0.3 percentage points at the reference prevalence of 25% and by approximately 0.8 at 60%, because the thermodynamic estimate is wrong too often to contribute.</w:t>
       </w:r>
     </w:p>
     <w:p>
@@ -12395,7 +12395,7 @@
           <w:i w:val="0"/>
           <w:sz w:val="21"/>
         </w:rPr>
-        <w:t>Table 6 and Fig. 7 give the normalized sensitivity coefficients of the corrected rate and the corresponding contributions to its combined standard uncertainty. The corrected rate is about 10 times more sensitive to a relative change in gas density or differential pressure (</w:t>
+        <w:t>Table 6 and Fig. 7 give the normalized sensitivity coefficients of the corrected rate and the corresponding contributions to its combined standard uncertainty. The corrected rate is approximately 10 times more sensitive to a relative change in gas density or differential pressure (</w:t>
       </w:r>
       <w:r>
         <w:rPr>
@@ -13507,7 +13507,7 @@
           <w:i w:val="0"/>
           <w:sz w:val="21"/>
         </w:rPr>
-        <w:t xml:space="preserve">It matters because of the size of its uncertainty rather than its coefficient. Gas density and differential pressure are known to a fraction of a percent (0.4% and 0.5%), whereas the liquid-loading estimate carries a relative standard uncertainty of 15%, about 30 times larger. The product, which is what enters the budget, is 0.76% for the liquid-loading estimate against 0.20% and 0.25% for gas density and differential pressure, a ratio of about 3. The liquid-loading estimate is the largest single contribution to the combined standard uncertainty: 40% of its variance at </w:t>
+        <w:t xml:space="preserve">It matters because of the size of its uncertainty rather than its coefficient. Gas density and differential pressure are known to a fraction of a percent (0.4% and 0.5%), whereas the liquid-loading estimate has a relative standard uncertainty of 15%, approximately 30 times greater. The product, which is what enters the budget, is 0.76% for the liquid-loading estimate against 0.20% and 0.25% for gas density and differential pressure, a ratio of approximately 3. The liquid-loading estimate is the largest single contribution to the combined standard uncertainty: 40% of its variance at </w:t>
       </w:r>
       <w:r>
         <w:rPr>
@@ -13536,7 +13536,7 @@
           <w:i w:val="0"/>
           <w:sz w:val="21"/>
         </w:rPr>
-        <w:t xml:space="preserve"> and 70% at 0.10, where the sensitivity has doubled; at the lower loading the lumped meter term and the correlation residual together account for the larger part. If the liquid-loading estimate were fully correlated with the gas-density term, the combined uncertainty at </w:t>
+        <w:t xml:space="preserve"> and 70% at 0.10, where the sensitivity has doubled; at the lower loading, the lumped meter term and the correlation residual together account for the larger part. If the liquid-loading estimate were fully correlated with the gas-density term, the combined uncertainty at </w:t>
       </w:r>
       <w:r>
         <w:rPr>
@@ -13711,7 +13711,7 @@
           <w:i w:val="0"/>
           <w:sz w:val="21"/>
         </w:rPr>
-        <w:t xml:space="preserve"> increases, while the Froude dependence is weak over the range examined, because the Chisholm form contains no explicit Froude term.</w:t>
+        <w:t xml:space="preserve"> increases, whereas the Froude dependence is weak over the range examined because the Chisholm form contains no explicit Froude term.</w:t>
       </w:r>
     </w:p>
     <w:p>
@@ -13886,7 +13886,7 @@
           <w:i w:val="0"/>
           <w:sz w:val="21"/>
         </w:rPr>
-        <w:t xml:space="preserve"> the test rejects 0.78% of all realizations; its specificity is 99.95%, its false-positive rate 0.05% and its precision 94.8% (94% on the sample of Section 4.3), but its sensitivity is 2.9%, so that 97% of the realizations that contain carryover are accepted. The area under the ROC curve is 0.81, and the average precision 0.69 against a prevalence of 25%, so the index separates the two populations only partially (Fig. 9a, b).</w:t>
+        <w:t>, the test rejects 0.78% of all realizations; its specificity is 99.95%, its false-positive rate 0.05% and its precision 94.8% (94% on the sample of Section 4.3), but its sensitivity is 2.9%, so that 97% of the realizations that contain carryover are accepted. The area under the ROC curve is 0.81, and the average precision 0.69 against a prevalence of 25%, so the index separates the two populations only partially (Fig. 9a, b).</w:t>
       </w:r>
     </w:p>
     <w:p>
@@ -13928,7 +13928,7 @@
           <w:i w:val="0"/>
           <w:sz w:val="21"/>
         </w:rPr>
-        <w:t xml:space="preserve"> the share of realizations rejected rises from 0.03% for carryover of 15–25% of the liquid to 8% for 45–60%, and at </w:t>
+        <w:t xml:space="preserve"> the share of realizations rejected increases from 0.03% for a carryover of 15–25% of the liquid to 8% for 45–60%, and at </w:t>
       </w:r>
       <w:r>
         <w:rPr>
@@ -13957,7 +13957,7 @@
           <w:i w:val="0"/>
           <w:sz w:val="21"/>
         </w:rPr>
-        <w:t xml:space="preserve"> from 40% to 94%. The index responds to large carryover and is nearly blind to small carryover, which is the regime in which the diagnostic estimator's own scatter (20%) masks it. Against the consequential-error target (an absolute corrected error above 3%, present in 8.5% of realizations) the area under the curve is 0.74 and the precision at </w:t>
+        <w:t xml:space="preserve"> from 40% to 94%. The index responds to large carryover and is nearly blind to small carryover, which is the regime in which the diagnostic estimator's own scatter (20%) masks it. Against the consequential-error target (an absolute corrected error above 3%, present in 8.5% of realizations) the area under the curve is 0.74, and the precision at </w:t>
       </w:r>
       <w:r>
         <w:rPr>
@@ -13986,7 +13986,7 @@
           <w:i w:val="0"/>
           <w:sz w:val="21"/>
         </w:rPr>
-        <w:t xml:space="preserve"> is 31%, so the index is a weaker predictor of a large corrected-rate error than of carryover. If the diagnostic estimator is poorer than assumed, with a relative uncertainty of 30% as may occur without the permanent pressure loss, the area under the curve falls to 0.71 and the sensitivity at </w:t>
+        <w:t xml:space="preserve"> is 31%, so the index is a weaker predictor of a large corrected-rate error than of carryover. If the diagnostic estimator is poorer than assumed, with a relative uncertainty of 30%, as may occur without permanent pressure loss, the area under the curve decreases to 0.71, and the sensitivity at </w:t>
       </w:r>
       <w:r>
         <w:rPr>
@@ -14103,7 +14103,7 @@
           <w:i w:val="0"/>
           <w:sz w:val="21"/>
         </w:rPr>
-        <w:t>The consistency test should therefore be read narrowly. At the adopted threshold the index is a gross-disagreement flag with high precision and low sensitivity, and it should not be described as a carryover detector. Its main role in the reference case is that of a validity check that withholds the correction when the two estimates are irreconcilable. Where the priority is to find carryover, a lower threshold is required, at the cost shown in Table 4.</w:t>
+        <w:t>The consistency test should therefore be read narrowly. At the adopted threshold, the index is a gross-disagreement flag with high precision and low sensitivity, and it should not be described as a carryover detector. Its main role in the reference case is that of a validity check that withholds the correction when the two estimates are irreconcilable. Where the priority is to find carryover, a lower threshold is required at the cost shown in Table 4.</w:t>
       </w:r>
     </w:p>
     <w:p>
@@ -14130,7 +14130,7 @@
           <w:i w:val="0"/>
           <w:sz w:val="21"/>
         </w:rPr>
-        <w:t xml:space="preserve">Table 7 compares the asymmetric rule of Eq. (12) with alternatives at three carryover prevalences, using the same realizations throughout. The controls are the thermodynamic and the diagnostic estimator alone and symmetric weighting. The alternatives are the one-sided Cauchy rule at five thresholds, a one-sided Huber weight, a two-sided Cauchy weight, and a one-sided hard switch that uses the diagnostic estimator alone when its excess exceeds </w:t>
+        <w:t xml:space="preserve">Table 7 compares the asymmetric rule of Eq. (12) with alternatives at three carryover prevalences, using the same realizations throughout. The controls are the thermodynamic and diagnostic estimator alone and symmetric weighting. The alternatives are the one-sided Cauchy rule at five thresholds, a one-sided Huber weight, a two-sided Cauchy weight, and a one-sided hard switch that uses the diagnostic estimator alone when its excess exceeds </w:t>
       </w:r>
       <w:r>
         <w:rPr>
@@ -15821,7 +15821,7 @@
           <w:i w:val="0"/>
           <w:sz w:val="21"/>
         </w:rPr>
-        <w:t xml:space="preserve">). Second, no rule is uniformly best. The smooth rule of Eq. (12) falls back toward the thermodynamic estimator when carryover is rare, and at 10% prevalence it is narrower than the diagnostic estimator alone (±3.75% against ±4.00%), whereas at 25% and 40% the diagnostic estimator alone is narrower. The hard one-sided switch at </w:t>
+        <w:t xml:space="preserve">). Second, no rule is uniformly best. The smooth rule of Eq. (12) falls back toward the thermodynamic estimator when carryover is rare, and at 10% prevalence, it is narrower than the diagnostic estimator alone (±3.75% against ±4.00%), whereas at 25% and 40%, the diagnostic estimator alone is narrower. The hard one-sided switch at </w:t>
       </w:r>
       <w:r>
         <w:rPr>
@@ -15842,7 +15842,7 @@
           <w:i w:val="0"/>
           <w:sz w:val="21"/>
         </w:rPr>
-        <w:t xml:space="preserve"> is narrower than the diagnostic estimator alone at all three prevalences (±3.49% at 25%), but it is poorer than Eq. (12) when carryover is absent (±3.49% against ±2.80% at zero prevalence, Fig. 10b). Third, the two-sided control is poorer than the one-sided rule (±4.37% against ±4.30%), which is the evidence for the one-sided form.</w:t>
+        <w:t xml:space="preserve"> is narrower than the diagnostic estimator alone at all three prevalences (±3.49% at 25%), but it is poorer than Eq. (12) when carryover is absent (±3.49% against ±2.80% at zero prevalence, Fig. 10b). Third, the two-sided control is poorer than the one-sided rule (±4.37% against ±4.30%), which is evidence for the one-sided form.</w:t>
       </w:r>
     </w:p>
     <w:p>
@@ -15896,7 +15896,7 @@
           <w:i w:val="0"/>
           <w:sz w:val="21"/>
         </w:rPr>
-        <w:t>Fig. 10 varies the assumptions on which the conclusions depend most. In Fig. 10a the actual relative uncertainty of the diagnostic estimator is varied from 10% to 60%, with the declared uncertainty either equal to the actual value or fixed at the assumed 20%. When the diagnostic estimator is better than assumed (10%), it is the best single estimator (±2.63%), and the full method is wider, ±2.71% when the uncertainty is declared correctly and ±3.87% when it is not. When it is worse (30%), the full method is narrower than the diagnostic estimator alone (±5.48% against ±5.71%, and ±4.97% if the 20% declaration is retained), and at 40% and 60% the thermodynamic estimator alone (±5.83%) is narrower than the diagnostic estimator alone (±7.55% and ±10.71%). The acceptance test limits the damage: at 60% the full method reaches ±6.10%, against ±9.88% for the asymmetric rule without it. The transfer bias matters less: raising its spread from 0 to 20% widens the full method from ±4.13% to ±5.22%.</w:t>
+        <w:t>Fig. 10 varies the assumptions on which the conclusions depend most. In Fig. 10a, the actual relative uncertainty of the diagnostic estimator is varied from 10% to 60%, with the declared uncertainty either equal to the actual value or fixed at the assumed 20%. When the diagnostic estimator is better than assumed (10%), it is the best single estimator (±2.63%), and the full method is wider, ±2.71% when the uncertainty is declared correctly and ±3.87% when it is not. When it is worse (30%), the full method is narrower than the diagnostic estimator alone (±5.48% against ±5.71%, and ±4.97% if the 20% declaration is retained), and at 40% and 60%, the thermodynamic estimator alone (±5.83%) is narrower than the diagnostic estimator alone (±7.55% and ±10.71%). The acceptance test limits the damage: at 60% the full method reaches ±6.10%, against ±9.88% for the asymmetric rule without it. The transfer bias matters less: raising its spread from 0 to 20% widens the full method from ±4.13% to ±5.22%.</w:t>
       </w:r>
     </w:p>
     <w:p>
@@ -15909,7 +15909,7 @@
           <w:i w:val="0"/>
           <w:sz w:val="21"/>
         </w:rPr>
-        <w:t>Fig. 10c replaces the population of sites by one site with a fixed transfer bias of the diagnostic estimator. The diagnostic estimator alone is narrowest with no bias (±3.91%) and widens in either direction, to ±5.12% at −15% and ±5.48% at +15%. The fused estimate is the more robust to a positive bias, because the thermodynamic estimate, biased low by carryover, offsets it: at +15% the full method gives ±3.56% against ±5.48%, and at −15% the two are similar (±4.97% and ±5.12%). This asymmetry is a property of the simulated carryover bias rather than a general benefit of fusion, and it would not occur if the thermodynamic estimator were biased in the same direction as the diagnostic one. The hard switch, which discards the thermodynamic estimate when the diagnostic excess is large, has no such protection (±5.34% at +15%).</w:t>
+        <w:t>Fig. 10c replaces the population of sites by one site with a fixed transfer bias of the diagnostic estimator. The diagnostic estimator alone is narrowest with no bias (±3.91%) and widens in either direction, to ±5.12% at −15% and ±5.48% at +15%. The fused estimate is more robust to a positive bias because the thermodynamic estimate, biased low by carryover, offsets it: at +15%, the full method gives ±3.56% against ±5.48%, and at −15%, the two are similar (±4.97% and ±5.12%). This asymmetry is a property of the simulated carryover bias rather than a general benefit of fusion, and it would not occur if the thermodynamic estimator were biased in the same direction as the diagnostic one. The hard switch, which discards the thermodynamic estimate when the diagnostic excess is large, has no such protection (±5.34% at +15%).</w:t>
       </w:r>
     </w:p>
     <w:p>
@@ -15922,7 +15922,7 @@
           <w:i w:val="0"/>
           <w:sz w:val="21"/>
         </w:rPr>
-        <w:t>Fig. 10b repeats the prevalence sweep of Section 4.5 on a finer grid with common random numbers, and Fig. 10d shows where the full method is narrower than the diagnostic estimator alone over the plane of diagnostic uncertainty and carryover prevalence. At the assumed 20% the crossing lies at a prevalence of about 16%; at 30% the full method is narrower up to about 30%; and at 40% it is narrower at every prevalence examined, up to 60%. When the diagnostic estimator is as good as 10%, the advantage of fusion is below 0.3 percentage points and disappears above 10% prevalence. The dashed lines of Fig. 10b show the effect of leaving the carryover allowance of Eq. (8) at its 25% value when the actual prevalence differs: at 60% prevalence the full method gives ±4.81% with a matched allowance and ±4.96% with the fixed one, and at zero prevalence ±2.71% and ±3.18%. The carryover prevalence therefore needs to be known only approximately.</w:t>
+        <w:t>Fig. 10b repeats the prevalence sweep of Section 4.5 on a finer grid with common random numbers, and Fig. 10d shows where the full method is narrower than the diagnostic estimator alone over the plane of diagnostic uncertainty and carryover prevalence. At the assumed 20%, the crossing lies at a prevalence of approximately 16%; at 30%, the full method is narrower up to approximately 30%; and at 40%, it is narrower at every prevalence examined, up to 60%. When the diagnostic estimator is as good as 10%, the advantage of fusion is less than 0.3 percentage points and disappears above 10% prevalence. The dashed lines of Fig. 10b show the effect of leaving the carryover allowance of Eq. (8) at its 25% value when the actual prevalence differs: at 60% prevalence, the full method gives ±4.81% with a matched allowance and ±4.96% with the fixed one, and at zero prevalence ±2.71% and ±3.18%. The carryover prevalence therefore needs to be known only approximately.</w:t>
       </w:r>
     </w:p>
     <w:p>
@@ -16002,7 +16002,7 @@
           <w:i w:val="0"/>
           <w:sz w:val="21"/>
         </w:rPr>
-        <w:t>In the reference simulation the meter reading is generated and corrected with the same correlation, so part of the favorable performance is built in. Table 8 and Fig. 11 replace the generating model while keeping the Chisholm multiplier as the correction (Section 3.2). With the independent orifice correlation of Murdock, the oracle band, which isolates the correlation error, rises from ±1.82% to ±2.58%, the diagnostic estimator alone from ±4.00% to ±4.97%, and the full method from ±4.26% to ±5.26%, with a bias of +1.19% instead of +0.58%. The correction model contributes an error that no liquid-loading estimator can remove, and the 95% error band of the whole method grows by about one percentage point.</w:t>
+        <w:t>In the reference simulation, the meter reading is generated and corrected with the same correlation, so part of the favorable performance is built in. Table 8 and Fig. 11 replace the generating model while keeping the Chisholm multiplier as the correction (Section 3.2). With the independent orifice correlation of Murdock, the oracle band, which isolates the correlation error, rises from ±1.82% to ±2.58%, the diagnostic estimator alone from ±4.00% to ±4.97%, and the full method from ±4.26% to ±5.26%, with a bias of +1.19% instead of +0.58%. The correction model contributes an error that no liquid-loading estimator can remove, and the 95% error band of the whole method grows by approximately one percentage point.</w:t>
       </w:r>
     </w:p>
     <w:tbl>
@@ -17257,7 +17257,7 @@
           <w:i w:val="0"/>
           <w:sz w:val="21"/>
         </w:rPr>
-        <w:t xml:space="preserve"> interval is 93.6% in the matched case, close to the nominal 95%, but falls to 88.5% with the independent correlation and to 87.2% when the over-reading is scaled up by 10%, and a declared model-form term of 5% of the over-reading restores only about one percentage point (89.5% and 88.3%). A term of about 15% of the over-reading is needed for the Murdock case to reach 94–95% coverage. The model-form allowance </w:t>
+        <w:t xml:space="preserve"> interval is 93.6% in the matched case, close to the nominal 95%, but falls to 88.5% with the independent correlation and to 87.2% when the over-reading is scaled up by 10%, and a declared model-form term of 5% of the over-reading restores only approximately one percentage point (89.5% and 88.3%). A term of approximately 15% of the over-reading is needed for the Murdock case to reach 94–95% coverage. The model-form allowance </w:t>
       </w:r>
       <w:r>
         <w:rPr>
@@ -17292,7 +17292,7 @@
           <w:i w:val="0"/>
           <w:sz w:val="21"/>
         </w:rPr>
-        <w:t>Second, the ranking of the methods changes with the sign of the correlation error. When the true over-reading is smaller than the correction assumes (scaled by 0.90 or 0.95), the full method is narrower than the diagnostic estimator alone (±3.20% against ±4.82% at 0.90), but this is a compensation of errors, since the downward bias that carryover gives the thermodynamic estimate offsets the overcorrection, and it should not be read as a benefit. When the true over-reading is larger, or with the independent correlation, the diagnostic estimator alone is narrower, as in the reference case. Third, a wrong functional form cannot be rescued by the estimator. With the Venturi form of de Leeuw as the truth, which lies outside the validity of that correlation for an orifice and is shown only as a limiting case, the oracle band is ±8.76% and the full method ±11.31%, with a coverage of 24%.</w:t>
+        <w:t>Second, the ranking of the methods changes with the sign of the correlation error. When the true over-reading is smaller than the correction assumes (scaled by 0.90 or 0.95), the full method is narrower than the diagnostic estimator alone (±3.20% against ±4.82% at 0.90), but this is a compensation of errors, since the downward bias that carryover gives the thermodynamic estimate offsets the overcorrection, and it should not be read as a benefit. When the true over-reading is larger, or with the independent correlation, the diagnostic estimator alone is narrower, as in the reference case. Third, a wrong functional form cannot be rescued by the estimator. With the Venturi form of de Leeuw as the truth, which lies outside the validity of that correlation for an orifice and is shown only as a limiting case, the oracle band is ±8.76%, and the full method ±11.31%, with a coverage of 24%.</w:t>
       </w:r>
     </w:p>
     <w:p>
@@ -18093,7 +18093,7 @@
           <w:i w:val="0"/>
           <w:sz w:val="21"/>
         </w:rPr>
-        <w:t>The distinction from the hybrid and data-driven methods is what is learned. Those methods learn the correction; the present one learns the input of the correction and leaves the correlation intact. The cost is an extra inference step, and a weaker result than direct learning can achieve where training data are plentiful. The benefit is that the physical form governs extrapolation, that the learned component is a single scalar with a stated uncertainty, and that a second estimate of that scalar exists and can be cross-checked, which is what makes the rejection mechanism possible at all; a method that learns the over-reading directly has no second opinion to consult. The uncertainty quantification framework of Hosseini et al. [17] addresses a related problem with a different emphasis: it quantifies the uncertainty of a learned predictor, whereas the mechanism here uses the disagreement between two structurally distinct estimators to decide whether to produce an output at all.</w:t>
+        <w:t>The distinction from the hybrid and data-driven methods is what is learned. Those methods learn the correction; the present one learns the input of the correction and leaves the correlation intact. The cost is an extra inference step, and a weaker result than direct learning can achieve where training data are plentiful. The benefit is that the physical form governs extrapolation, that the learned component is a single scalar with a stated uncertainty and that a second estimate of that scalar exists and can be cross-checked, which is what makes the rejection mechanism possible at all; a method that learns the over-reading directly has no second opinion to consult. The uncertainty quantification framework of Hosseini et al. [17] addresses a related problem with a different emphasis: it quantifies the uncertainty of a learned predictor, whereas the mechanism here uses the disagreement between two structurally distinct estimators to decide whether to produce an output at all.</w:t>
       </w:r>
     </w:p>
     <w:p>
@@ -18120,7 +18120,7 @@
           <w:i w:val="0"/>
           <w:sz w:val="21"/>
         </w:rPr>
-        <w:t>The method can be implemented as a secondary-instrumentation layer adjacent to the existing flow computer (Fig. 12). The layer reads the transmitters, the chromatograph and the meter diagnostics and publishes the corrected rate, its uncertainty, the fused liquid loading and the status. Because it is realized in software and reads existing signals, it introduces no additional process restriction and therefore no additional pressure drop. Two properties matter for an installed measurement system. If the layer is lost, the meter reverts to its present behavior, and when its assumptions are not met the layer declines to answer rather than answering unreliably, which is the behavior a measurement system should exhibit.</w:t>
+        <w:t>The method can be implemented as a secondary-instrumentation layer adjacent to the existing flow computer (Fig. 12). The layer reads the transmitters, the chromatograph and the meter diagnostics and publishes the corrected rate, its uncertainty, the fused liquid loading and the status. Because it is realized in software and reads existing signals, it introduces no additional process restriction and therefore no additional pressure drop. Two properties matter for an installed measurement system. If the layer is lost, the meter reverts to its present behavior, and when its assumptions are not met, the layer declines to answer rather than answering unreliably, which is the behavior a measurement system should exhibit.</w:t>
       </w:r>
     </w:p>
     <w:p>
@@ -18186,7 +18186,7 @@
           <w:i w:val="0"/>
           <w:sz w:val="21"/>
         </w:rPr>
-        <w:t xml:space="preserve">For the orifice case the diagnostic estimator requires the signals that the flow computer already reads — line pressure, temperature, differential pressure and indicated rate — together with the gas density from the composition, a composition measurement for the thermodynamic estimator, and the high-rate differential-pressure signal from which </w:t>
+        <w:t xml:space="preserve">For the orifice case, the diagnostic estimator requires the signals that the flow computer already reads — line pressure, temperature, differential pressure and indicated rate — together with the gas density from the composition, a composition measurement for the thermodynamic estimator, and the high-rate differential-pressure signal from which </w:t>
       </w:r>
       <w:r>
         <w:rPr>
@@ -18208,7 +18208,7 @@
           <w:i w:val="0"/>
           <w:sz w:val="21"/>
         </w:rPr>
-        <w:t xml:space="preserve"> is computed. The permanent pressure loss ratio requires a downstream tapping. Where it is absent, the feature vector of Eq. (6) loses its recovery term, the diagnostic estimator becomes less informative, and its declared uncertainty must be widened before the framework is used; the size of that widening can be known only from a fit without the feature. As an indication, if the actual relative uncertainty were 30% instead of 20%, the full method would reach ±5.48% (±4.97% if the 20% declaration were retained), against ±5.71% for the diagnostic estimator alone and ±5.83% for the thermodynamic estimator alone (Fig. 10a). Without the high-rate differential-pressure signal the diagnostic estimator is not specified by this paper and the method is not supported, since the thermodynamic estimator would then be the only estimator and no consistency test would be available.</w:t>
+        <w:t xml:space="preserve"> is computed. The permanent pressure loss ratio requires downstream tapping. Where it is absent, the feature vector of Eq. (6) loses its recovery term, the diagnostic estimator becomes less informative, and its declared uncertainty must be widened before the framework is used; the size of that widening can be known only from a fit without the feature. As an indication, if the actual relative uncertainty were 30% instead of 20%, the full method would reach ±5.48% (±4.97% if the 20% declaration were retained), against ±5.71% for the diagnostic estimator alone and ±5.83% for the thermodynamic estimator alone (Fig. 10a). Without the high-rate differential-pressure signal, the diagnostic estimator is not specified by this paper, and the method is not supported since the thermodynamic estimator would then be the only estimator and no consistency test would be available.</w:t>
       </w:r>
     </w:p>
     <w:p>
@@ -18235,7 +18235,7 @@
           <w:i w:val="0"/>
           <w:sz w:val="21"/>
         </w:rPr>
-        <w:t>The architecture is meter-agnostic, but the diagnostic estimator is not. For multipath ultrasonic meters [31] the natural features are the deviation of the measured speed of sound from the value computed from the composition [32], the gain levels, the signal-to-noise ratio and the ratios of the path velocities, since a liquid film degrades the near-wall chords before the mid-radius chords. For Coriolis meters [33] they are the drive gain and the deviation of the indicated mixture density from the gas density of the equation of state. These are extension pathways and not results. No computational assessment of either is presented, and the Coriolis case is expected to be harder, because resolving the gas from the total mass requires the liquid fraction to a tighter tolerance than a differential-pressure meter does.</w:t>
+        <w:t>The architecture is meter-agnostic, but the diagnostic estimator is not. For multipath ultrasonic meters [31] the natural features are the deviation of the measured speed of sound from the value computed from the composition [32], the gain levels, the signal-to-noise ratio and the ratios of the path velocities, since a liquid film degrades the near-wall chords before the mid-radius chords. For Coriolis meters [33] they are the drive gain and the deviation of the indicated mixture density from the gas density of the equation of state. These are extension pathways and not results. No computational assessment of either is presented, and the Coriolis case is expected to be more difficult because resolving the gas from the total mass requires the liquid fraction to a tighter tolerance than a differential-pressure meter does.</w:t>
       </w:r>
     </w:p>
     <w:p>
@@ -18902,7 +18902,7 @@
           <w:i w:val="0"/>
           <w:sz w:val="21"/>
         </w:rPr>
-        <w:t>No experimental wet-gas data were used, and every result is a modeled uncertainty. In the reference case the over-reading correlation is both the forward model and the correction. Section 4.11 shows that an independent correlation widens the error band by about one percentage point and that nominal coverage then requires a model-form allowance, about 15% of the over-reading here, which is specific to the correlations, geometry and conditions tested and must be calibrated for each application. Those scenarios are stress tests and not measured error bounds, and only an independent experimental reference removes the circularity.</w:t>
+        <w:t>No experimental wet-gas data were used, and every result is a modeled uncertainty. In the reference case, the over-reading correlation is both the forward model and the correction. Section 4.11 shows that an independent correlation widens the error band by approximately one percentage point and that nominal coverage then requires a model-form allowance, approximately 15% of the over-reading here, which is specific to the correlations, geometry and conditions tested and must be calibrated for each application. Those scenarios are stress tests and not measured error bounds, and only an independent experimental reference removes the circularity.</w:t>
       </w:r>
     </w:p>
     <w:p>
@@ -19088,7 +19088,7 @@
           <w:i w:val="0"/>
           <w:sz w:val="21"/>
         </w:rPr>
-        <w:t xml:space="preserve"> the consistency index has a sensitivity of about 3% for carryover (Section 4.8), so it should not be presented as a carryover detector.</w:t>
+        <w:t>, the consistency index has a sensitivity of approximately 3% for carryover (Section 4.8), so it should not be presented as a carryover detector.</w:t>
       </w:r>
     </w:p>
     <w:p>
@@ -19291,7 +19291,7 @@
           <w:i w:val="0"/>
           <w:sz w:val="21"/>
         </w:rPr>
-        <w:t>In this study the liquid loading of a wet-gas stream is treated as a latent variable, estimated from two structurally distinct sources already present at a metering station and passed to the established over-reading correlation, and the framework is tested by Monte Carlo propagation over a rich-gas envelope. The outcome of each test is reported, including where the method does not improve on a simpler alternative.</w:t>
+        <w:t>In this study, the liquid loading of a wet-gas stream is treated as a latent variable, estimated from two structurally distinct sources already present at a metering station and passed to the established over-reading correlation, and the framework is tested by Monte Carlo propagation over a rich-gas envelope. The outcome of each test is reported, including where the method does not improve on a simpler alternative.</w:t>
       </w:r>
     </w:p>
     <w:p>
@@ -19304,7 +19304,7 @@
           <w:i w:val="0"/>
           <w:sz w:val="21"/>
         </w:rPr>
-        <w:t xml:space="preserve">Correction reduces the simulated 95% error band of the orifice case from ±14.94% to ±4.26% (±4.28% over all realizations before the acceptance test), against ±1.82% for the same correlation supplied with the true liquid loading. The diagnostic estimator alone gives ±3.99%, so fusion does not improve on it in the reference case; it does so when carryover occupies less than about 16% of operating time, when the diagnostic estimator is poorer than assumed, or when it carries a persistent positive bias. Combining a thermodynamic and a diagnostic estimate requires the thermodynamic estimator to declare an uncertainty that includes the upstream carryover it cannot observe, and without that allowance inverse-variance fusion (±5.45%) is worse than the diagnostic estimator alone. A one-sided damping rule improves on symmetric weighting, but </w:t>
+        <w:t xml:space="preserve">Correction reduces the simulated 95% error band of the orifice case from ±14.94% to ±4.26% (±4.28% over all realizations before the acceptance test), against ±1.82% for the same correlation supplied with the true liquid loading. The diagnostic estimator alone gives ±3.99%, so fusion does not improve on it in the reference case; it does so when carryover occupies less than approximately 16% of the operating time, when the diagnostic estimator is poorer than assumed, or when it has a persistent positive bias. Combining a thermodynamic and a diagnostic estimate requires the thermodynamic estimator to declare an uncertainty that includes the upstream carryover it cannot observe, and without that allowance, inverse-variance fusion (±5.45%) is worse than the diagnostic estimator alone. A one-sided damping rule improves on symmetric weighting, but </w:t>
       </w:r>
       <w:r>
         <w:rPr>
@@ -19338,7 +19338,7 @@
           <w:i w:val="0"/>
           <w:sz w:val="21"/>
         </w:rPr>
-        <w:t>At the adopted threshold the consistency index has a precision of 94% for carryover, which is present in 25% of the simulated realizations, and a sensitivity of 3%: it rejects very few realizations and nearly all of them contain carryover, but it misses most of the carryover present and responds mainly to large carryover. It is a gross-disagreement flag rather than a carryover detector, and a lower threshold trades completeness for sensitivity. Because the two estimates are not statistically independent, the covariance term must be retained in the index; omitting it does not degrade the test gracefully but progressively disables it, so that it accepts everything.</w:t>
+        <w:t>At the adopted threshold, the consistency index has a precision of 94% for carryover, which is present in 25% of the simulated realizations, and a sensitivity of 3%: it rejects very few realizations, and nearly all of them contain carryover, but it misses most of the carryover present and responds mainly to large carryover. It is a gross-disagreement flag rather than a carryover detector, and a lower threshold trades completeness for sensitivity. Because the two estimates are not statistically independent, the covariance term must be retained in the index; omitting it does not degrade the test gracefully but progressively disables it so that it accepts everything.</w:t>
       </w:r>
     </w:p>
     <w:p>
@@ -19351,7 +19351,7 @@
           <w:i w:val="0"/>
           <w:sz w:val="21"/>
         </w:rPr>
-        <w:t xml:space="preserve">The corrected rate is about ten times more sensitive to a relative change in gas density or differential pressure than to one in liquid loading, yet the liquid-loading estimate is the largest single contribution to the combined standard uncertainty, 40% of its variance at </w:t>
+        <w:t xml:space="preserve">The corrected rate is approximately ten times more sensitive to a relative change in gas density or differential pressure than to one in liquid loading, yet the liquid-loading estimate is the largest single contribution to the combined standard uncertainty, 40% of its variance at </w:t>
       </w:r>
       <w:r>
         <w:rPr>
@@ -19380,7 +19380,7 @@
           <w:i w:val="0"/>
           <w:sz w:val="21"/>
         </w:rPr>
-        <w:t xml:space="preserve"> and 70% at 0.10, because its relative uncertainty of 15% is about thirty times larger; sensitivity coefficients and uncertainty contributions must be reported together. Replacing the matched forward model by an independent orifice correlation widens the error band by about one percentage point and lowers the realized coverage of the declared interval to 89% unless a model-form allowance is declared, and that allowance must be calibrated for the meter geometry and conditions, since a generic value cannot guarantee nominal coverage.</w:t>
+        <w:t xml:space="preserve"> and 70% at 0.10, because its relative uncertainty of 15% is approximately thirty times larger; sensitivity coefficients and uncertainty contributions must be reported together. Replacing the matched forward model by an independent orifice correlation widens the error band by approximately one percentage point and lowers the realized coverage of the declared interval to 89% unless a model-form allowance is declared and that allowance must be calibrated for the meter geometry and conditions, since a generic value cannot guarantee nominal coverage.</w:t>
       </w:r>
     </w:p>
     <w:p>
@@ -21707,7 +21707,7 @@
           <w:i w:val="0"/>
           <w:sz w:val="21"/>
         </w:rPr>
-        <w:t>During the preparation of this work the author used Claude (Anthropic) as a drafting and analysis aid: to draft and edit manuscript text, including the restructuring of the present revision; to write the Python that implements the simulation and the scripts that check it; and to typeset the equations and tables. The author specified the measurement problem, the estimation architecture, the assumptions and their ranges, directed and reviewed the analysis, inspected the outputs and figures, and decided the conclusions, including the findings that the diagnostic estimator alone is narrower than the fused estimate in the reference case and that the consistency index is not a carryover detector. Verification was performed by the deposited scripts rather than by hand, which is a check of internal consistency and of the numbers as computed, not an independent check of the physical validity of the model. No AI tool is listed as an author, none generated or altered data, and the author takes full responsibility for the content of the publication.</w:t>
+        <w:t>During the preparation of this work, the author used Claude (Anthropic) as a drafting and analysis aid: to draft and edit the manuscript text, including the restructuring of the present revision; to write the Python that implements the simulation and the scripts that check it; and to typeset the equations and tables. The author specified the measurement problem, the estimation architecture, the assumptions and their ranges, directed and reviewed the analysis, inspected the outputs and figures, and decided the conclusions, including the findings that the diagnostic estimator alone is narrower than the fused estimate in the reference case and that the consistency index is not a carryover detector. Verification was performed by the deposited scripts rather than by hand, which is a check of internal consistency and of the numbers as computed, not an independent check of the physical validity of the model. No AI tool is listed as an author, none generated or altered data, and the author takes full responsibility for the content of the publication.</w:t>
       </w:r>
     </w:p>
     <w:p>
@@ -23666,7 +23666,7 @@
           <w:i/>
           <w:sz w:val="18"/>
         </w:rPr>
-        <w:t>Table A2. Verification of the implementation. Every entry is computed by verify_revision.py; differences are absolute unless stated.</w:t>
+        <w:t>Table A2. Verification of the implementation. Every entry is computed by verify_revision.py; differences are absolute unless otherwise stated.</w:t>
       </w:r>
     </w:p>
     <w:p>

</xml_diff>

<commit_message>
v1.2.1: validation outcomes split into performance targets vs refutation; detector figures as in Table 4
Section 5.5 separates missed performance targets (diagnostic uncertainty, detector
threshold) from refutation of the estimation framework. Abstract, conclusions and
highlights quote the Table 4 values (94.8% precision, 2.9% sensitivity). Inline math:
no space after control words; d ln spacing. Equations visually checked (17/17).

Co-Authored-By: Claude Opus 5.5 <noreply@anthropic.com>
</commit_message>
<xml_diff>
--- a/manuscript/FMI_Hybrid_Liquid_Loading_Estimation_v6.docx
+++ b/manuscript/FMI_Hybrid_Liquid_Loading_Estimation_v6.docx
@@ -91,7 +91,7 @@
           <w:i w:val="0"/>
           <w:sz w:val="21"/>
         </w:rPr>
-        <w:t>Wet-gas corrections for differential-pressure flowmeters express the indicated gas rate as the true rate multiplied by an over-reading factor that depends on the Lockhart–Martinelli parameter, which most metering stations do not measure. Here, the liquid loading is treated as a latent variable and estimated from two structurally distinct sources already at the station: a thermodynamic flash prediction from composition, pressure and temperature and a regression on the meter's own diagnostic signals. The two estimates are fused under an uncertainty budget that includes upstream liquid carryover, which the flash cannot see, and their disagreement, a consistency index, determines whether the correlation is applied. The study is computational: no loop data were used, and the diagnostic estimator is specified but not fitted, so every result is a modeled uncertainty. Over 300,000 Monte Carlo realizations of an orifice meter in a rich-gas envelope (60–85 kgf/cm², 30–60 °C), correction narrows the 95% error band from ±14.94% to ±4.26% (±4.28% before the acceptance test), against ±1.82% with the true liquid loading and ±3.99% for the diagnostic estimator alone. Fusion therefore improves on the diagnostic estimator only when carryover occupies less than approximately 16% of the operating time, when the diagnostic estimator is poorer than assumed, or when it has a persistent positive bias. At the adopted threshold, the consistency index has 94% precision but 3% sensitivity for carryover: it flags gross disagreement rather than detecting carryover. An independent orifice correlation in the forward model widens the band to ±5.26%. A falsifiable loop experiment is specified.</w:t>
+        <w:t>Wet-gas corrections for differential-pressure flowmeters express the indicated gas rate as the true rate multiplied by an over-reading factor that depends on the Lockhart–Martinelli parameter, which most metering stations do not measure. Here, the liquid loading is treated as a latent variable and estimated from two structurally distinct sources already at the station: a thermodynamic flash prediction from composition, pressure and temperature and a regression on the meter's own diagnostic signals. The two estimates are fused under an uncertainty budget that includes upstream liquid carryover, which the flash cannot see, and their disagreement, a consistency index, determines whether the correlation is applied. The study is computational: no loop data were used, and the diagnostic estimator is specified but not fitted, so every result is a modeled uncertainty. Over 300,000 Monte Carlo realizations of an orifice meter in a rich-gas envelope (60–85 kgf/cm², 30–60 °C), correction narrows the 95% error band from ±14.94% to ±4.26% (±4.28% before the acceptance test), against ±1.82% with the true liquid loading and ±3.99% for the diagnostic estimator alone. Fusion therefore improves on the diagnostic estimator only when carryover occupies less than approximately 16% of the operating time, when the diagnostic estimator is poorer than assumed, or when it has a persistent positive bias. At the adopted threshold, the consistency index has 94.8% precision but 2.9% sensitivity for carryover: it flags gross disagreement rather than detecting carryover. An independent orifice correlation in the forward model widens the band to ±5.26%. A falsifiable loop experiment is specified.</w:t>
       </w:r>
     </w:p>
     <w:p>
@@ -636,7 +636,7 @@
           <w:sz w:val="21"/>
           <w:vertAlign w:val="subscript"/>
         </w:rPr>
-        <w:t>Δ P</w:t>
+        <w:t>ΔP</w:t>
       </w:r>
       <w:r>
         <w:rPr>
@@ -1026,7 +1026,7 @@
                 <w:sz w:val="17"/>
                 <w:vertAlign w:val="subscript"/>
               </w:rPr>
-              <w:t>Δ P</w:t>
+              <w:t>ΔP</w:t>
             </w:r>
             <w:r>
               <w:rPr>
@@ -1597,7 +1597,7 @@
           <w:i w:val="0"/>
           <w:sz w:val="21"/>
         </w:rPr>
-        <w:t>)/(2 × 1.645)</w:t>
+        <w:t>)/(2 ×1.645)</w:t>
       </w:r>
       <w:r>
         <w:rPr>
@@ -1828,7 +1828,7 @@
           <w:i w:val="0"/>
           <w:sz w:val="21"/>
         </w:rPr>
-        <w:t xml:space="preserve"> ≤ </w:t>
+        <w:t xml:space="preserve"> ≤</w:t>
       </w:r>
       <w:r>
         <w:rPr>
@@ -4717,7 +4717,7 @@
           <w:i w:val="0"/>
           <w:sz w:val="21"/>
         </w:rPr>
-        <w:t xml:space="preserve">(Δ </w:t>
+        <w:t>(Δ</w:t>
       </w:r>
       <w:r>
         <w:rPr>
@@ -5387,7 +5387,7 @@
           <w:i w:val="0"/>
           <w:sz w:val="21"/>
         </w:rPr>
-        <w:t xml:space="preserve"> = −dln</w:t>
+        <w:t xml:space="preserve"> = −d ln </w:t>
       </w:r>
       <w:r>
         <w:rPr>
@@ -5401,7 +5401,7 @@
           <w:i w:val="0"/>
           <w:sz w:val="21"/>
         </w:rPr>
-        <w:t xml:space="preserve">/dln </w:t>
+        <w:t xml:space="preserve">/d ln </w:t>
       </w:r>
       <w:r>
         <w:rPr>
@@ -5763,7 +5763,7 @@
           <w:i w:val="0"/>
           <w:sz w:val="21"/>
         </w:rPr>
-        <w:t xml:space="preserve"> Eq. (8) gives </w:t>
+        <w:t xml:space="preserve">, Eq. (8) gives </w:t>
       </w:r>
       <w:r>
         <w:rPr>
@@ -6167,7 +6167,7 @@
           <w:i w:val="0"/>
           <w:sz w:val="21"/>
         </w:rPr>
-        <w:t xml:space="preserve"> = max(0, </w:t>
+        <w:t xml:space="preserve"> = max (0, </w:t>
       </w:r>
       <w:r>
         <w:rPr>
@@ -6359,7 +6359,7 @@
           <w:i w:val="0"/>
           <w:sz w:val="21"/>
         </w:rPr>
-        <w:t xml:space="preserve">max(1, </w:t>
+        <w:t xml:space="preserve">max (1, </w:t>
       </w:r>
       <w:r>
         <w:rPr>
@@ -6554,7 +6554,7 @@
           <w:i w:val="0"/>
           <w:sz w:val="21"/>
         </w:rPr>
-        <w:t xml:space="preserve">, which has </w:t>
+        <w:t xml:space="preserve">, which carries </w:t>
       </w:r>
       <w:r>
         <w:rPr>
@@ -6691,7 +6691,7 @@
           <w:i w:val="0"/>
           <w:sz w:val="21"/>
         </w:rPr>
-        <w:t xml:space="preserve"> − 1)/</w:t>
+        <w:t>− 1)/</w:t>
       </w:r>
       <w:r>
         <w:rPr>
@@ -8358,7 +8358,7 @@
           <w:i w:val="0"/>
           <w:sz w:val="21"/>
         </w:rPr>
-        <w:t xml:space="preserve"> = 1 + 1.26</w:t>
+        <w:t>= 1 + 1.26</w:t>
       </w:r>
       <w:r>
         <w:rPr>
@@ -8394,7 +8394,7 @@
           <w:i w:val="0"/>
           <w:sz w:val="21"/>
         </w:rPr>
-        <w:t xml:space="preserve"> − 1</w:t>
+        <w:t>− 1</w:t>
       </w:r>
       <w:r>
         <w:rPr>
@@ -12409,7 +12409,7 @@
           <w:i w:val="0"/>
           <w:sz w:val="21"/>
         </w:rPr>
-        <w:t xml:space="preserve"> ≈ +0.5</w:t>
+        <w:t xml:space="preserve"> ≈+0.5</w:t>
       </w:r>
       <w:r>
         <w:rPr>
@@ -12430,7 +12430,7 @@
           <w:i w:val="0"/>
           <w:sz w:val="21"/>
         </w:rPr>
-        <w:t xml:space="preserve"> ≈ −0.05</w:t>
+        <w:t xml:space="preserve"> ≈−0.05</w:t>
       </w:r>
       <w:r>
         <w:rPr>
@@ -12988,7 +12988,7 @@
                 <w:i w:val="0"/>
                 <w:sz w:val="17"/>
               </w:rPr>
-              <w:t xml:space="preserve">Δ </w:t>
+              <w:t>Δ</w:t>
             </w:r>
             <w:r>
               <w:rPr>
@@ -17209,7 +17209,7 @@
           <w:i/>
           <w:sz w:val="18"/>
         </w:rPr>
-        <w:t xml:space="preserve"> − 1</w:t>
+        <w:t>− 1</w:t>
       </w:r>
       <w:r>
         <w:rPr>
@@ -18201,7 +18201,7 @@
           <w:sz w:val="21"/>
           <w:vertAlign w:val="subscript"/>
         </w:rPr>
-        <w:t>Δ P</w:t>
+        <w:t>ΔP</w:t>
       </w:r>
       <w:r>
         <w:rPr>
@@ -18695,7 +18695,7 @@
                 <w:i w:val="0"/>
                 <w:sz w:val="17"/>
               </w:rPr>
-              <w:t xml:space="preserve">Δ </w:t>
+              <w:t>Δ</w:t>
             </w:r>
             <w:r>
               <w:rPr>
@@ -18724,7 +18724,7 @@
                 <w:sz w:val="17"/>
                 <w:vertAlign w:val="subscript"/>
               </w:rPr>
-              <w:t>Δ P</w:t>
+              <w:t>ΔP</w:t>
             </w:r>
             <w:r>
               <w:rPr>
@@ -19143,7 +19143,7 @@
           <w:sz w:val="21"/>
           <w:vertAlign w:val="subscript"/>
         </w:rPr>
-        <w:t>Δ P</w:t>
+        <w:t>ΔP</w:t>
       </w:r>
       <w:r>
         <w:rPr>
@@ -19220,7 +19220,20 @@
           <w:i w:val="0"/>
           <w:sz w:val="21"/>
         </w:rPr>
-        <w:t xml:space="preserve">The framework is refuted if any of the following holds on loop data: the fitted diagnostic estimator does not recover </w:t>
+        <w:t>The outcomes of this experiment fall into two classes, which should be kept apart. The first class concerns the performance targets set in this paper. A fitted diagnostic estimator whose calibrated relative uncertainty exceeds the 20% assumed in Table 2 misses a specified target; it does not refute the framework, but it moves the regime in which fusion is worthwhile in the way Section 4.10 describes. Likewise, a consistency index whose adopted threshold does not reproduce the detection rates of Table 4 calls for a different threshold or weighting rule, not for a different estimation method.</w:t>
+      </w:r>
+    </w:p>
+    <w:p>
+      <w:pPr>
+        <w:spacing w:before="0" w:after="160"/>
+        <w:ind w:firstLine="317"/>
+      </w:pPr>
+      <w:r>
+        <w:rPr>
+          <w:i w:val="0"/>
+          <w:sz w:val="21"/>
+        </w:rPr>
+        <w:t xml:space="preserve">The second class concerns the estimation framework itself, which is refuted if any of the following holds on loop data: the diagnostic signals carry no usable information about </w:t>
       </w:r>
       <w:r>
         <w:rPr>
@@ -19242,7 +19255,7 @@
           <w:i w:val="0"/>
           <w:sz w:val="21"/>
         </w:rPr>
-        <w:t xml:space="preserve"> within the 20% relative uncertainty assumed in Table 2; the consistency index does not preferentially flag the runs with deliberate upstream injection; the measured correlation </w:t>
+        <w:t xml:space="preserve">, so that no fitted diagnostic estimator improves on the thermodynamic estimate alone; disagreement between the two estimates is not more frequent in the runs with deliberate upstream injection at any threshold, so that the consistency index cannot separate them; the measured correlation </w:t>
       </w:r>
       <w:r>
         <w:rPr>
@@ -19264,7 +19277,7 @@
           <w:i w:val="0"/>
           <w:sz w:val="21"/>
         </w:rPr>
-        <w:t xml:space="preserve"> is large enough that the acceptance test loses the sensitivity reported in Section 4.4; or the corrected gas rate fails to improve on the uncorrected meter within the admissibility region of Fig. 8.</w:t>
+        <w:t xml:space="preserve"> is large enough that even the covariance-aware acceptance test loses the sensitivity reported in Section 4.4; or the corrected gas rate fails to improve on the uncorrected meter within the admissibility region of Fig. 8.</w:t>
       </w:r>
     </w:p>
     <w:p>
@@ -19338,7 +19351,7 @@
           <w:i w:val="0"/>
           <w:sz w:val="21"/>
         </w:rPr>
-        <w:t>At the adopted threshold, the consistency index has a precision of 94% for carryover, which is present in 25% of the simulated realizations, and a sensitivity of 3%: it rejects very few realizations, and nearly all of them contain carryover, but it misses most of the carryover present and responds mainly to large carryover. It is a gross-disagreement flag rather than a carryover detector, and a lower threshold trades completeness for sensitivity. Because the two estimates are not statistically independent, the covariance term must be retained in the index; omitting it does not degrade the test gracefully but progressively disables it so that it accepts everything.</w:t>
+        <w:t>At the adopted threshold, the consistency index has a precision of 94.8% for carryover, which is present in 25% of the simulated realizations, and a sensitivity of 2.9% (Table 4): it rejects very few realizations, and nearly all of them contain carryover, but it misses most of the carryover present and responds mainly to large carryover. It is a gross-disagreement flag rather than a carryover detector, and a lower threshold trades completeness for sensitivity. Because the two estimates are not statistically independent, the covariance term must be retained in the index; omitting it does not degrade the test gracefully but progressively disables it so that it accepts everything.</w:t>
       </w:r>
     </w:p>
     <w:p>
@@ -20192,7 +20205,7 @@
                 <w:i w:val="0"/>
                 <w:sz w:val="17"/>
               </w:rPr>
-              <w:t xml:space="preserve">Δ </w:t>
+              <w:t>Δ</w:t>
             </w:r>
             <w:r>
               <w:rPr>
@@ -20265,7 +20278,7 @@
                 <w:sz w:val="17"/>
                 <w:vertAlign w:val="subscript"/>
               </w:rPr>
-              <w:t>Δ P</w:t>
+              <w:t>ΔP</w:t>
             </w:r>
           </w:p>
         </w:tc>

</xml_diff>